<commit_message>
Correct questionnaire table proportions
</commit_message>
<xml_diff>
--- a/docs/GeoSentri_Mobile_Police_Personnel_Evaluation_Questionnaire.docx
+++ b/docs/GeoSentri_Mobile_Police_Personnel_Evaluation_Questionnaire.docx
@@ -237,7 +237,7 @@
           <w:tcPr>
             <w:tcW w:type="dxa" w:w="2189"/>
             <w:vAlign w:val="center"/>
-            <w:shd w:fill="000000"/>
+            <w:shd w:fill="D9D9D9"/>
           </w:tcPr>
           <w:p>
             <w:pPr>
@@ -249,7 +249,7 @@
               <w:rPr>
                 <w:rFonts w:ascii="Arial" w:hAnsi="Arial"/>
                 <w:b/>
-                <w:color w:val="FFFFFF"/>
+                <w:color w:val="111111"/>
                 <w:sz w:val="17"/>
               </w:rPr>
               <w:t>5</w:t>
@@ -260,7 +260,7 @@
           <w:tcPr>
             <w:tcW w:type="dxa" w:w="2189"/>
             <w:vAlign w:val="center"/>
-            <w:shd w:fill="000000"/>
+            <w:shd w:fill="D9D9D9"/>
           </w:tcPr>
           <w:p>
             <w:pPr>
@@ -272,7 +272,7 @@
               <w:rPr>
                 <w:rFonts w:ascii="Arial" w:hAnsi="Arial"/>
                 <w:b/>
-                <w:color w:val="FFFFFF"/>
+                <w:color w:val="111111"/>
                 <w:sz w:val="17"/>
               </w:rPr>
               <w:t>4</w:t>
@@ -283,7 +283,7 @@
           <w:tcPr>
             <w:tcW w:type="dxa" w:w="2189"/>
             <w:vAlign w:val="center"/>
-            <w:shd w:fill="000000"/>
+            <w:shd w:fill="D9D9D9"/>
           </w:tcPr>
           <w:p>
             <w:pPr>
@@ -295,7 +295,7 @@
               <w:rPr>
                 <w:rFonts w:ascii="Arial" w:hAnsi="Arial"/>
                 <w:b/>
-                <w:color w:val="FFFFFF"/>
+                <w:color w:val="111111"/>
                 <w:sz w:val="17"/>
               </w:rPr>
               <w:t>3</w:t>
@@ -306,7 +306,7 @@
           <w:tcPr>
             <w:tcW w:type="dxa" w:w="2189"/>
             <w:vAlign w:val="center"/>
-            <w:shd w:fill="000000"/>
+            <w:shd w:fill="D9D9D9"/>
           </w:tcPr>
           <w:p>
             <w:pPr>
@@ -318,7 +318,7 @@
               <w:rPr>
                 <w:rFonts w:ascii="Arial" w:hAnsi="Arial"/>
                 <w:b/>
-                <w:color w:val="FFFFFF"/>
+                <w:color w:val="111111"/>
                 <w:sz w:val="17"/>
               </w:rPr>
               <w:t>2</w:t>
@@ -329,7 +329,7 @@
           <w:tcPr>
             <w:tcW w:type="dxa" w:w="2189"/>
             <w:vAlign w:val="center"/>
-            <w:shd w:fill="000000"/>
+            <w:shd w:fill="D9D9D9"/>
           </w:tcPr>
           <w:p>
             <w:pPr>
@@ -341,7 +341,7 @@
               <w:rPr>
                 <w:rFonts w:ascii="Arial" w:hAnsi="Arial"/>
                 <w:b/>
-                <w:color w:val="FFFFFF"/>
+                <w:color w:val="111111"/>
                 <w:sz w:val="17"/>
               </w:rPr>
               <w:t>1</w:t>
@@ -524,10 +524,10 @@
         </w:trPr>
         <w:tc>
           <w:tcPr>
-            <w:tcW w:type="dxa" w:w="1563"/>
+            <w:tcW w:type="dxa" w:w="518"/>
             <w:vMerge w:val="restart"/>
             <w:vAlign w:val="center"/>
-            <w:shd w:fill="000000"/>
+            <w:shd w:fill="D9D9D9"/>
           </w:tcPr>
           <w:p>
             <w:pPr>
@@ -539,7 +539,7 @@
               <w:rPr>
                 <w:rFonts w:ascii="Arial" w:hAnsi="Arial"/>
                 <w:b/>
-                <w:color w:val="FFFFFF"/>
+                <w:color w:val="111111"/>
                 <w:sz w:val="15"/>
               </w:rPr>
               <w:t>NO.</w:t>
@@ -548,10 +548,10 @@
         </w:tc>
         <w:tc>
           <w:tcPr>
-            <w:tcW w:type="dxa" w:w="1563"/>
+            <w:tcW w:type="dxa" w:w="7762"/>
             <w:vMerge w:val="restart"/>
             <w:vAlign w:val="center"/>
-            <w:shd w:fill="000000"/>
+            <w:shd w:fill="D9D9D9"/>
           </w:tcPr>
           <w:p>
             <w:pPr>
@@ -563,7 +563,7 @@
               <w:rPr>
                 <w:rFonts w:ascii="Arial" w:hAnsi="Arial"/>
                 <w:b/>
-                <w:color w:val="FFFFFF"/>
+                <w:color w:val="111111"/>
                 <w:sz w:val="15"/>
               </w:rPr>
               <w:t>STATEMENTS</w:t>
@@ -572,10 +572,10 @@
         </w:tc>
         <w:tc>
           <w:tcPr>
-            <w:tcW w:type="dxa" w:w="7815"/>
+            <w:tcW w:type="dxa" w:w="2664"/>
             <w:gridSpan w:val="5"/>
             <w:vAlign w:val="center"/>
-            <w:shd w:fill="000000"/>
+            <w:shd w:fill="D9D9D9"/>
           </w:tcPr>
           <w:p>
             <w:pPr>
@@ -587,7 +587,7 @@
               <w:rPr>
                 <w:rFonts w:ascii="Arial" w:hAnsi="Arial"/>
                 <w:b/>
-                <w:color w:val="FFFFFF"/>
+                <w:color w:val="111111"/>
                 <w:sz w:val="15"/>
               </w:rPr>
               <w:t>LEVEL OF AGREEMENT</w:t>
@@ -616,9 +616,9 @@
         </w:tc>
         <w:tc>
           <w:tcPr>
-            <w:tcW w:type="dxa" w:w="1563"/>
-            <w:vAlign w:val="center"/>
-            <w:shd w:fill="000000"/>
+            <w:tcW w:type="dxa" w:w="533"/>
+            <w:vAlign w:val="center"/>
+            <w:shd w:fill="D9D9D9"/>
           </w:tcPr>
           <w:p>
             <w:pPr>
@@ -630,7 +630,7 @@
               <w:rPr>
                 <w:rFonts w:ascii="Arial" w:hAnsi="Arial"/>
                 <w:b/>
-                <w:color w:val="FFFFFF"/>
+                <w:color w:val="111111"/>
                 <w:sz w:val="15"/>
               </w:rPr>
               <w:t>5</w:t>
@@ -639,9 +639,9 @@
         </w:tc>
         <w:tc>
           <w:tcPr>
-            <w:tcW w:type="dxa" w:w="1563"/>
-            <w:vAlign w:val="center"/>
-            <w:shd w:fill="000000"/>
+            <w:tcW w:type="dxa" w:w="533"/>
+            <w:vAlign w:val="center"/>
+            <w:shd w:fill="D9D9D9"/>
           </w:tcPr>
           <w:p>
             <w:pPr>
@@ -653,7 +653,7 @@
               <w:rPr>
                 <w:rFonts w:ascii="Arial" w:hAnsi="Arial"/>
                 <w:b/>
-                <w:color w:val="FFFFFF"/>
+                <w:color w:val="111111"/>
                 <w:sz w:val="15"/>
               </w:rPr>
               <w:t>4</w:t>
@@ -662,9 +662,9 @@
         </w:tc>
         <w:tc>
           <w:tcPr>
-            <w:tcW w:type="dxa" w:w="1563"/>
-            <w:vAlign w:val="center"/>
-            <w:shd w:fill="000000"/>
+            <w:tcW w:type="dxa" w:w="533"/>
+            <w:vAlign w:val="center"/>
+            <w:shd w:fill="D9D9D9"/>
           </w:tcPr>
           <w:p>
             <w:pPr>
@@ -676,7 +676,7 @@
               <w:rPr>
                 <w:rFonts w:ascii="Arial" w:hAnsi="Arial"/>
                 <w:b/>
-                <w:color w:val="FFFFFF"/>
+                <w:color w:val="111111"/>
                 <w:sz w:val="15"/>
               </w:rPr>
               <w:t>3</w:t>
@@ -685,9 +685,9 @@
         </w:tc>
         <w:tc>
           <w:tcPr>
-            <w:tcW w:type="dxa" w:w="1563"/>
-            <w:vAlign w:val="center"/>
-            <w:shd w:fill="000000"/>
+            <w:tcW w:type="dxa" w:w="533"/>
+            <w:vAlign w:val="center"/>
+            <w:shd w:fill="D9D9D9"/>
           </w:tcPr>
           <w:p>
             <w:pPr>
@@ -699,7 +699,7 @@
               <w:rPr>
                 <w:rFonts w:ascii="Arial" w:hAnsi="Arial"/>
                 <w:b/>
-                <w:color w:val="FFFFFF"/>
+                <w:color w:val="111111"/>
                 <w:sz w:val="15"/>
               </w:rPr>
               <w:t>2</w:t>
@@ -708,9 +708,9 @@
         </w:tc>
         <w:tc>
           <w:tcPr>
-            <w:tcW w:type="dxa" w:w="1563"/>
-            <w:vAlign w:val="center"/>
-            <w:shd w:fill="000000"/>
+            <w:tcW w:type="dxa" w:w="533"/>
+            <w:vAlign w:val="center"/>
+            <w:shd w:fill="D9D9D9"/>
           </w:tcPr>
           <w:p>
             <w:pPr>
@@ -722,7 +722,7 @@
               <w:rPr>
                 <w:rFonts w:ascii="Arial" w:hAnsi="Arial"/>
                 <w:b/>
-                <w:color w:val="FFFFFF"/>
+                <w:color w:val="111111"/>
                 <w:sz w:val="15"/>
               </w:rPr>
               <w:t>1</w:t>
@@ -736,7 +736,7 @@
         </w:trPr>
         <w:tc>
           <w:tcPr>
-            <w:tcW w:type="dxa" w:w="1563"/>
+            <w:tcW w:type="dxa" w:w="518"/>
             <w:vAlign w:val="center"/>
           </w:tcPr>
           <w:p>
@@ -758,7 +758,7 @@
         </w:tc>
         <w:tc>
           <w:tcPr>
-            <w:tcW w:type="dxa" w:w="1563"/>
+            <w:tcW w:type="dxa" w:w="7762"/>
             <w:vAlign w:val="center"/>
           </w:tcPr>
           <w:p>
@@ -780,7 +780,7 @@
         </w:tc>
         <w:tc>
           <w:tcPr>
-            <w:tcW w:type="dxa" w:w="1563"/>
+            <w:tcW w:type="dxa" w:w="533"/>
             <w:vAlign w:val="center"/>
           </w:tcPr>
           <w:p>
@@ -802,7 +802,7 @@
         </w:tc>
         <w:tc>
           <w:tcPr>
-            <w:tcW w:type="dxa" w:w="1563"/>
+            <w:tcW w:type="dxa" w:w="533"/>
             <w:vAlign w:val="center"/>
           </w:tcPr>
           <w:p>
@@ -824,7 +824,7 @@
         </w:tc>
         <w:tc>
           <w:tcPr>
-            <w:tcW w:type="dxa" w:w="1563"/>
+            <w:tcW w:type="dxa" w:w="533"/>
             <w:vAlign w:val="center"/>
           </w:tcPr>
           <w:p>
@@ -846,7 +846,7 @@
         </w:tc>
         <w:tc>
           <w:tcPr>
-            <w:tcW w:type="dxa" w:w="1563"/>
+            <w:tcW w:type="dxa" w:w="533"/>
             <w:vAlign w:val="center"/>
           </w:tcPr>
           <w:p>
@@ -868,7 +868,7 @@
         </w:tc>
         <w:tc>
           <w:tcPr>
-            <w:tcW w:type="dxa" w:w="1563"/>
+            <w:tcW w:type="dxa" w:w="533"/>
             <w:vAlign w:val="center"/>
           </w:tcPr>
           <w:p>
@@ -895,8 +895,8 @@
         </w:trPr>
         <w:tc>
           <w:tcPr>
-            <w:tcW w:type="dxa" w:w="1563"/>
-            <w:shd w:fill="F2F2F2"/>
+            <w:tcW w:type="dxa" w:w="518"/>
+            <w:shd w:fill="F5F5F5"/>
             <w:vAlign w:val="center"/>
           </w:tcPr>
           <w:p>
@@ -918,8 +918,8 @@
         </w:tc>
         <w:tc>
           <w:tcPr>
-            <w:tcW w:type="dxa" w:w="1563"/>
-            <w:shd w:fill="F2F2F2"/>
+            <w:tcW w:type="dxa" w:w="7762"/>
+            <w:shd w:fill="F5F5F5"/>
             <w:vAlign w:val="center"/>
           </w:tcPr>
           <w:p>
@@ -941,8 +941,8 @@
         </w:tc>
         <w:tc>
           <w:tcPr>
-            <w:tcW w:type="dxa" w:w="1563"/>
-            <w:shd w:fill="F2F2F2"/>
+            <w:tcW w:type="dxa" w:w="533"/>
+            <w:shd w:fill="F5F5F5"/>
             <w:vAlign w:val="center"/>
           </w:tcPr>
           <w:p>
@@ -964,8 +964,8 @@
         </w:tc>
         <w:tc>
           <w:tcPr>
-            <w:tcW w:type="dxa" w:w="1563"/>
-            <w:shd w:fill="F2F2F2"/>
+            <w:tcW w:type="dxa" w:w="533"/>
+            <w:shd w:fill="F5F5F5"/>
             <w:vAlign w:val="center"/>
           </w:tcPr>
           <w:p>
@@ -987,8 +987,8 @@
         </w:tc>
         <w:tc>
           <w:tcPr>
-            <w:tcW w:type="dxa" w:w="1563"/>
-            <w:shd w:fill="F2F2F2"/>
+            <w:tcW w:type="dxa" w:w="533"/>
+            <w:shd w:fill="F5F5F5"/>
             <w:vAlign w:val="center"/>
           </w:tcPr>
           <w:p>
@@ -1010,8 +1010,8 @@
         </w:tc>
         <w:tc>
           <w:tcPr>
-            <w:tcW w:type="dxa" w:w="1563"/>
-            <w:shd w:fill="F2F2F2"/>
+            <w:tcW w:type="dxa" w:w="533"/>
+            <w:shd w:fill="F5F5F5"/>
             <w:vAlign w:val="center"/>
           </w:tcPr>
           <w:p>
@@ -1033,8 +1033,8 @@
         </w:tc>
         <w:tc>
           <w:tcPr>
-            <w:tcW w:type="dxa" w:w="1563"/>
-            <w:shd w:fill="F2F2F2"/>
+            <w:tcW w:type="dxa" w:w="533"/>
+            <w:shd w:fill="F5F5F5"/>
             <w:vAlign w:val="center"/>
           </w:tcPr>
           <w:p>
@@ -1061,7 +1061,7 @@
         </w:trPr>
         <w:tc>
           <w:tcPr>
-            <w:tcW w:type="dxa" w:w="1563"/>
+            <w:tcW w:type="dxa" w:w="518"/>
             <w:vAlign w:val="center"/>
           </w:tcPr>
           <w:p>
@@ -1083,7 +1083,7 @@
         </w:tc>
         <w:tc>
           <w:tcPr>
-            <w:tcW w:type="dxa" w:w="1563"/>
+            <w:tcW w:type="dxa" w:w="7762"/>
             <w:vAlign w:val="center"/>
           </w:tcPr>
           <w:p>
@@ -1105,7 +1105,7 @@
         </w:tc>
         <w:tc>
           <w:tcPr>
-            <w:tcW w:type="dxa" w:w="1563"/>
+            <w:tcW w:type="dxa" w:w="533"/>
             <w:vAlign w:val="center"/>
           </w:tcPr>
           <w:p>
@@ -1127,7 +1127,7 @@
         </w:tc>
         <w:tc>
           <w:tcPr>
-            <w:tcW w:type="dxa" w:w="1563"/>
+            <w:tcW w:type="dxa" w:w="533"/>
             <w:vAlign w:val="center"/>
           </w:tcPr>
           <w:p>
@@ -1149,7 +1149,7 @@
         </w:tc>
         <w:tc>
           <w:tcPr>
-            <w:tcW w:type="dxa" w:w="1563"/>
+            <w:tcW w:type="dxa" w:w="533"/>
             <w:vAlign w:val="center"/>
           </w:tcPr>
           <w:p>
@@ -1171,7 +1171,7 @@
         </w:tc>
         <w:tc>
           <w:tcPr>
-            <w:tcW w:type="dxa" w:w="1563"/>
+            <w:tcW w:type="dxa" w:w="533"/>
             <w:vAlign w:val="center"/>
           </w:tcPr>
           <w:p>
@@ -1193,7 +1193,7 @@
         </w:tc>
         <w:tc>
           <w:tcPr>
-            <w:tcW w:type="dxa" w:w="1563"/>
+            <w:tcW w:type="dxa" w:w="533"/>
             <w:vAlign w:val="center"/>
           </w:tcPr>
           <w:p>
@@ -1220,8 +1220,8 @@
         </w:trPr>
         <w:tc>
           <w:tcPr>
-            <w:tcW w:type="dxa" w:w="1563"/>
-            <w:shd w:fill="F2F2F2"/>
+            <w:tcW w:type="dxa" w:w="518"/>
+            <w:shd w:fill="F5F5F5"/>
             <w:vAlign w:val="center"/>
           </w:tcPr>
           <w:p>
@@ -1243,8 +1243,8 @@
         </w:tc>
         <w:tc>
           <w:tcPr>
-            <w:tcW w:type="dxa" w:w="1563"/>
-            <w:shd w:fill="F2F2F2"/>
+            <w:tcW w:type="dxa" w:w="7762"/>
+            <w:shd w:fill="F5F5F5"/>
             <w:vAlign w:val="center"/>
           </w:tcPr>
           <w:p>
@@ -1266,8 +1266,8 @@
         </w:tc>
         <w:tc>
           <w:tcPr>
-            <w:tcW w:type="dxa" w:w="1563"/>
-            <w:shd w:fill="F2F2F2"/>
+            <w:tcW w:type="dxa" w:w="533"/>
+            <w:shd w:fill="F5F5F5"/>
             <w:vAlign w:val="center"/>
           </w:tcPr>
           <w:p>
@@ -1289,8 +1289,8 @@
         </w:tc>
         <w:tc>
           <w:tcPr>
-            <w:tcW w:type="dxa" w:w="1563"/>
-            <w:shd w:fill="F2F2F2"/>
+            <w:tcW w:type="dxa" w:w="533"/>
+            <w:shd w:fill="F5F5F5"/>
             <w:vAlign w:val="center"/>
           </w:tcPr>
           <w:p>
@@ -1312,8 +1312,8 @@
         </w:tc>
         <w:tc>
           <w:tcPr>
-            <w:tcW w:type="dxa" w:w="1563"/>
-            <w:shd w:fill="F2F2F2"/>
+            <w:tcW w:type="dxa" w:w="533"/>
+            <w:shd w:fill="F5F5F5"/>
             <w:vAlign w:val="center"/>
           </w:tcPr>
           <w:p>
@@ -1335,8 +1335,8 @@
         </w:tc>
         <w:tc>
           <w:tcPr>
-            <w:tcW w:type="dxa" w:w="1563"/>
-            <w:shd w:fill="F2F2F2"/>
+            <w:tcW w:type="dxa" w:w="533"/>
+            <w:shd w:fill="F5F5F5"/>
             <w:vAlign w:val="center"/>
           </w:tcPr>
           <w:p>
@@ -1358,8 +1358,8 @@
         </w:tc>
         <w:tc>
           <w:tcPr>
-            <w:tcW w:type="dxa" w:w="1563"/>
-            <w:shd w:fill="F2F2F2"/>
+            <w:tcW w:type="dxa" w:w="533"/>
+            <w:shd w:fill="F5F5F5"/>
             <w:vAlign w:val="center"/>
           </w:tcPr>
           <w:p>
@@ -1386,7 +1386,7 @@
         </w:trPr>
         <w:tc>
           <w:tcPr>
-            <w:tcW w:type="dxa" w:w="1563"/>
+            <w:tcW w:type="dxa" w:w="518"/>
             <w:vAlign w:val="center"/>
           </w:tcPr>
           <w:p>
@@ -1408,7 +1408,7 @@
         </w:tc>
         <w:tc>
           <w:tcPr>
-            <w:tcW w:type="dxa" w:w="1563"/>
+            <w:tcW w:type="dxa" w:w="7762"/>
             <w:vAlign w:val="center"/>
           </w:tcPr>
           <w:p>
@@ -1430,7 +1430,7 @@
         </w:tc>
         <w:tc>
           <w:tcPr>
-            <w:tcW w:type="dxa" w:w="1563"/>
+            <w:tcW w:type="dxa" w:w="533"/>
             <w:vAlign w:val="center"/>
           </w:tcPr>
           <w:p>
@@ -1452,7 +1452,7 @@
         </w:tc>
         <w:tc>
           <w:tcPr>
-            <w:tcW w:type="dxa" w:w="1563"/>
+            <w:tcW w:type="dxa" w:w="533"/>
             <w:vAlign w:val="center"/>
           </w:tcPr>
           <w:p>
@@ -1474,7 +1474,7 @@
         </w:tc>
         <w:tc>
           <w:tcPr>
-            <w:tcW w:type="dxa" w:w="1563"/>
+            <w:tcW w:type="dxa" w:w="533"/>
             <w:vAlign w:val="center"/>
           </w:tcPr>
           <w:p>
@@ -1496,7 +1496,7 @@
         </w:tc>
         <w:tc>
           <w:tcPr>
-            <w:tcW w:type="dxa" w:w="1563"/>
+            <w:tcW w:type="dxa" w:w="533"/>
             <w:vAlign w:val="center"/>
           </w:tcPr>
           <w:p>
@@ -1518,7 +1518,7 @@
         </w:tc>
         <w:tc>
           <w:tcPr>
-            <w:tcW w:type="dxa" w:w="1563"/>
+            <w:tcW w:type="dxa" w:w="533"/>
             <w:vAlign w:val="center"/>
           </w:tcPr>
           <w:p>
@@ -1545,8 +1545,8 @@
         </w:trPr>
         <w:tc>
           <w:tcPr>
-            <w:tcW w:type="dxa" w:w="1563"/>
-            <w:shd w:fill="F2F2F2"/>
+            <w:tcW w:type="dxa" w:w="518"/>
+            <w:shd w:fill="F5F5F5"/>
             <w:vAlign w:val="center"/>
           </w:tcPr>
           <w:p>
@@ -1568,8 +1568,8 @@
         </w:tc>
         <w:tc>
           <w:tcPr>
-            <w:tcW w:type="dxa" w:w="1563"/>
-            <w:shd w:fill="F2F2F2"/>
+            <w:tcW w:type="dxa" w:w="7762"/>
+            <w:shd w:fill="F5F5F5"/>
             <w:vAlign w:val="center"/>
           </w:tcPr>
           <w:p>
@@ -1591,8 +1591,8 @@
         </w:tc>
         <w:tc>
           <w:tcPr>
-            <w:tcW w:type="dxa" w:w="1563"/>
-            <w:shd w:fill="F2F2F2"/>
+            <w:tcW w:type="dxa" w:w="533"/>
+            <w:shd w:fill="F5F5F5"/>
             <w:vAlign w:val="center"/>
           </w:tcPr>
           <w:p>
@@ -1614,8 +1614,8 @@
         </w:tc>
         <w:tc>
           <w:tcPr>
-            <w:tcW w:type="dxa" w:w="1563"/>
-            <w:shd w:fill="F2F2F2"/>
+            <w:tcW w:type="dxa" w:w="533"/>
+            <w:shd w:fill="F5F5F5"/>
             <w:vAlign w:val="center"/>
           </w:tcPr>
           <w:p>
@@ -1637,8 +1637,8 @@
         </w:tc>
         <w:tc>
           <w:tcPr>
-            <w:tcW w:type="dxa" w:w="1563"/>
-            <w:shd w:fill="F2F2F2"/>
+            <w:tcW w:type="dxa" w:w="533"/>
+            <w:shd w:fill="F5F5F5"/>
             <w:vAlign w:val="center"/>
           </w:tcPr>
           <w:p>
@@ -1660,8 +1660,8 @@
         </w:tc>
         <w:tc>
           <w:tcPr>
-            <w:tcW w:type="dxa" w:w="1563"/>
-            <w:shd w:fill="F2F2F2"/>
+            <w:tcW w:type="dxa" w:w="533"/>
+            <w:shd w:fill="F5F5F5"/>
             <w:vAlign w:val="center"/>
           </w:tcPr>
           <w:p>
@@ -1683,8 +1683,8 @@
         </w:tc>
         <w:tc>
           <w:tcPr>
-            <w:tcW w:type="dxa" w:w="1563"/>
-            <w:shd w:fill="F2F2F2"/>
+            <w:tcW w:type="dxa" w:w="533"/>
+            <w:shd w:fill="F5F5F5"/>
             <w:vAlign w:val="center"/>
           </w:tcPr>
           <w:p>
@@ -1711,7 +1711,7 @@
         </w:trPr>
         <w:tc>
           <w:tcPr>
-            <w:tcW w:type="dxa" w:w="1563"/>
+            <w:tcW w:type="dxa" w:w="518"/>
             <w:vAlign w:val="center"/>
           </w:tcPr>
           <w:p>
@@ -1733,7 +1733,7 @@
         </w:tc>
         <w:tc>
           <w:tcPr>
-            <w:tcW w:type="dxa" w:w="1563"/>
+            <w:tcW w:type="dxa" w:w="7762"/>
             <w:vAlign w:val="center"/>
           </w:tcPr>
           <w:p>
@@ -1755,7 +1755,7 @@
         </w:tc>
         <w:tc>
           <w:tcPr>
-            <w:tcW w:type="dxa" w:w="1563"/>
+            <w:tcW w:type="dxa" w:w="533"/>
             <w:vAlign w:val="center"/>
           </w:tcPr>
           <w:p>
@@ -1777,7 +1777,7 @@
         </w:tc>
         <w:tc>
           <w:tcPr>
-            <w:tcW w:type="dxa" w:w="1563"/>
+            <w:tcW w:type="dxa" w:w="533"/>
             <w:vAlign w:val="center"/>
           </w:tcPr>
           <w:p>
@@ -1799,7 +1799,7 @@
         </w:tc>
         <w:tc>
           <w:tcPr>
-            <w:tcW w:type="dxa" w:w="1563"/>
+            <w:tcW w:type="dxa" w:w="533"/>
             <w:vAlign w:val="center"/>
           </w:tcPr>
           <w:p>
@@ -1821,7 +1821,7 @@
         </w:tc>
         <w:tc>
           <w:tcPr>
-            <w:tcW w:type="dxa" w:w="1563"/>
+            <w:tcW w:type="dxa" w:w="533"/>
             <w:vAlign w:val="center"/>
           </w:tcPr>
           <w:p>
@@ -1843,7 +1843,7 @@
         </w:tc>
         <w:tc>
           <w:tcPr>
-            <w:tcW w:type="dxa" w:w="1563"/>
+            <w:tcW w:type="dxa" w:w="533"/>
             <w:vAlign w:val="center"/>
           </w:tcPr>
           <w:p>
@@ -1870,8 +1870,8 @@
         </w:trPr>
         <w:tc>
           <w:tcPr>
-            <w:tcW w:type="dxa" w:w="1563"/>
-            <w:shd w:fill="F2F2F2"/>
+            <w:tcW w:type="dxa" w:w="518"/>
+            <w:shd w:fill="F5F5F5"/>
             <w:vAlign w:val="center"/>
           </w:tcPr>
           <w:p>
@@ -1893,8 +1893,8 @@
         </w:tc>
         <w:tc>
           <w:tcPr>
-            <w:tcW w:type="dxa" w:w="1563"/>
-            <w:shd w:fill="F2F2F2"/>
+            <w:tcW w:type="dxa" w:w="7762"/>
+            <w:shd w:fill="F5F5F5"/>
             <w:vAlign w:val="center"/>
           </w:tcPr>
           <w:p>
@@ -1916,8 +1916,8 @@
         </w:tc>
         <w:tc>
           <w:tcPr>
-            <w:tcW w:type="dxa" w:w="1563"/>
-            <w:shd w:fill="F2F2F2"/>
+            <w:tcW w:type="dxa" w:w="533"/>
+            <w:shd w:fill="F5F5F5"/>
             <w:vAlign w:val="center"/>
           </w:tcPr>
           <w:p>
@@ -1939,8 +1939,8 @@
         </w:tc>
         <w:tc>
           <w:tcPr>
-            <w:tcW w:type="dxa" w:w="1563"/>
-            <w:shd w:fill="F2F2F2"/>
+            <w:tcW w:type="dxa" w:w="533"/>
+            <w:shd w:fill="F5F5F5"/>
             <w:vAlign w:val="center"/>
           </w:tcPr>
           <w:p>
@@ -1962,8 +1962,8 @@
         </w:tc>
         <w:tc>
           <w:tcPr>
-            <w:tcW w:type="dxa" w:w="1563"/>
-            <w:shd w:fill="F2F2F2"/>
+            <w:tcW w:type="dxa" w:w="533"/>
+            <w:shd w:fill="F5F5F5"/>
             <w:vAlign w:val="center"/>
           </w:tcPr>
           <w:p>
@@ -1985,8 +1985,8 @@
         </w:tc>
         <w:tc>
           <w:tcPr>
-            <w:tcW w:type="dxa" w:w="1563"/>
-            <w:shd w:fill="F2F2F2"/>
+            <w:tcW w:type="dxa" w:w="533"/>
+            <w:shd w:fill="F5F5F5"/>
             <w:vAlign w:val="center"/>
           </w:tcPr>
           <w:p>
@@ -2008,8 +2008,8 @@
         </w:tc>
         <w:tc>
           <w:tcPr>
-            <w:tcW w:type="dxa" w:w="1563"/>
-            <w:shd w:fill="F2F2F2"/>
+            <w:tcW w:type="dxa" w:w="533"/>
+            <w:shd w:fill="F5F5F5"/>
             <w:vAlign w:val="center"/>
           </w:tcPr>
           <w:p>
@@ -2085,10 +2085,10 @@
         </w:trPr>
         <w:tc>
           <w:tcPr>
-            <w:tcW w:type="dxa" w:w="1563"/>
+            <w:tcW w:type="dxa" w:w="518"/>
             <w:vMerge w:val="restart"/>
             <w:vAlign w:val="center"/>
-            <w:shd w:fill="000000"/>
+            <w:shd w:fill="D9D9D9"/>
           </w:tcPr>
           <w:p>
             <w:pPr>
@@ -2100,7 +2100,7 @@
               <w:rPr>
                 <w:rFonts w:ascii="Arial" w:hAnsi="Arial"/>
                 <w:b/>
-                <w:color w:val="FFFFFF"/>
+                <w:color w:val="111111"/>
                 <w:sz w:val="15"/>
               </w:rPr>
               <w:t>NO.</w:t>
@@ -2109,10 +2109,10 @@
         </w:tc>
         <w:tc>
           <w:tcPr>
-            <w:tcW w:type="dxa" w:w="1563"/>
+            <w:tcW w:type="dxa" w:w="7762"/>
             <w:vMerge w:val="restart"/>
             <w:vAlign w:val="center"/>
-            <w:shd w:fill="000000"/>
+            <w:shd w:fill="D9D9D9"/>
           </w:tcPr>
           <w:p>
             <w:pPr>
@@ -2124,7 +2124,7 @@
               <w:rPr>
                 <w:rFonts w:ascii="Arial" w:hAnsi="Arial"/>
                 <w:b/>
-                <w:color w:val="FFFFFF"/>
+                <w:color w:val="111111"/>
                 <w:sz w:val="15"/>
               </w:rPr>
               <w:t>STATEMENTS</w:t>
@@ -2133,10 +2133,10 @@
         </w:tc>
         <w:tc>
           <w:tcPr>
-            <w:tcW w:type="dxa" w:w="7815"/>
+            <w:tcW w:type="dxa" w:w="2664"/>
             <w:gridSpan w:val="5"/>
             <w:vAlign w:val="center"/>
-            <w:shd w:fill="000000"/>
+            <w:shd w:fill="D9D9D9"/>
           </w:tcPr>
           <w:p>
             <w:pPr>
@@ -2148,7 +2148,7 @@
               <w:rPr>
                 <w:rFonts w:ascii="Arial" w:hAnsi="Arial"/>
                 <w:b/>
-                <w:color w:val="FFFFFF"/>
+                <w:color w:val="111111"/>
                 <w:sz w:val="15"/>
               </w:rPr>
               <w:t>LEVEL OF AGREEMENT</w:t>
@@ -2177,9 +2177,9 @@
         </w:tc>
         <w:tc>
           <w:tcPr>
-            <w:tcW w:type="dxa" w:w="1563"/>
-            <w:vAlign w:val="center"/>
-            <w:shd w:fill="000000"/>
+            <w:tcW w:type="dxa" w:w="533"/>
+            <w:vAlign w:val="center"/>
+            <w:shd w:fill="D9D9D9"/>
           </w:tcPr>
           <w:p>
             <w:pPr>
@@ -2191,7 +2191,7 @@
               <w:rPr>
                 <w:rFonts w:ascii="Arial" w:hAnsi="Arial"/>
                 <w:b/>
-                <w:color w:val="FFFFFF"/>
+                <w:color w:val="111111"/>
                 <w:sz w:val="15"/>
               </w:rPr>
               <w:t>5</w:t>
@@ -2200,9 +2200,9 @@
         </w:tc>
         <w:tc>
           <w:tcPr>
-            <w:tcW w:type="dxa" w:w="1563"/>
-            <w:vAlign w:val="center"/>
-            <w:shd w:fill="000000"/>
+            <w:tcW w:type="dxa" w:w="533"/>
+            <w:vAlign w:val="center"/>
+            <w:shd w:fill="D9D9D9"/>
           </w:tcPr>
           <w:p>
             <w:pPr>
@@ -2214,7 +2214,7 @@
               <w:rPr>
                 <w:rFonts w:ascii="Arial" w:hAnsi="Arial"/>
                 <w:b/>
-                <w:color w:val="FFFFFF"/>
+                <w:color w:val="111111"/>
                 <w:sz w:val="15"/>
               </w:rPr>
               <w:t>4</w:t>
@@ -2223,9 +2223,9 @@
         </w:tc>
         <w:tc>
           <w:tcPr>
-            <w:tcW w:type="dxa" w:w="1563"/>
-            <w:vAlign w:val="center"/>
-            <w:shd w:fill="000000"/>
+            <w:tcW w:type="dxa" w:w="533"/>
+            <w:vAlign w:val="center"/>
+            <w:shd w:fill="D9D9D9"/>
           </w:tcPr>
           <w:p>
             <w:pPr>
@@ -2237,7 +2237,7 @@
               <w:rPr>
                 <w:rFonts w:ascii="Arial" w:hAnsi="Arial"/>
                 <w:b/>
-                <w:color w:val="FFFFFF"/>
+                <w:color w:val="111111"/>
                 <w:sz w:val="15"/>
               </w:rPr>
               <w:t>3</w:t>
@@ -2246,9 +2246,9 @@
         </w:tc>
         <w:tc>
           <w:tcPr>
-            <w:tcW w:type="dxa" w:w="1563"/>
-            <w:vAlign w:val="center"/>
-            <w:shd w:fill="000000"/>
+            <w:tcW w:type="dxa" w:w="533"/>
+            <w:vAlign w:val="center"/>
+            <w:shd w:fill="D9D9D9"/>
           </w:tcPr>
           <w:p>
             <w:pPr>
@@ -2260,7 +2260,7 @@
               <w:rPr>
                 <w:rFonts w:ascii="Arial" w:hAnsi="Arial"/>
                 <w:b/>
-                <w:color w:val="FFFFFF"/>
+                <w:color w:val="111111"/>
                 <w:sz w:val="15"/>
               </w:rPr>
               <w:t>2</w:t>
@@ -2269,9 +2269,9 @@
         </w:tc>
         <w:tc>
           <w:tcPr>
-            <w:tcW w:type="dxa" w:w="1563"/>
-            <w:vAlign w:val="center"/>
-            <w:shd w:fill="000000"/>
+            <w:tcW w:type="dxa" w:w="533"/>
+            <w:vAlign w:val="center"/>
+            <w:shd w:fill="D9D9D9"/>
           </w:tcPr>
           <w:p>
             <w:pPr>
@@ -2283,7 +2283,7 @@
               <w:rPr>
                 <w:rFonts w:ascii="Arial" w:hAnsi="Arial"/>
                 <w:b/>
-                <w:color w:val="FFFFFF"/>
+                <w:color w:val="111111"/>
                 <w:sz w:val="15"/>
               </w:rPr>
               <w:t>1</w:t>
@@ -2297,7 +2297,7 @@
         </w:trPr>
         <w:tc>
           <w:tcPr>
-            <w:tcW w:type="dxa" w:w="1563"/>
+            <w:tcW w:type="dxa" w:w="518"/>
             <w:vAlign w:val="center"/>
           </w:tcPr>
           <w:p>
@@ -2319,7 +2319,7 @@
         </w:tc>
         <w:tc>
           <w:tcPr>
-            <w:tcW w:type="dxa" w:w="1563"/>
+            <w:tcW w:type="dxa" w:w="7762"/>
             <w:vAlign w:val="center"/>
           </w:tcPr>
           <w:p>
@@ -2341,7 +2341,7 @@
         </w:tc>
         <w:tc>
           <w:tcPr>
-            <w:tcW w:type="dxa" w:w="1563"/>
+            <w:tcW w:type="dxa" w:w="533"/>
             <w:vAlign w:val="center"/>
           </w:tcPr>
           <w:p>
@@ -2363,7 +2363,7 @@
         </w:tc>
         <w:tc>
           <w:tcPr>
-            <w:tcW w:type="dxa" w:w="1563"/>
+            <w:tcW w:type="dxa" w:w="533"/>
             <w:vAlign w:val="center"/>
           </w:tcPr>
           <w:p>
@@ -2385,7 +2385,7 @@
         </w:tc>
         <w:tc>
           <w:tcPr>
-            <w:tcW w:type="dxa" w:w="1563"/>
+            <w:tcW w:type="dxa" w:w="533"/>
             <w:vAlign w:val="center"/>
           </w:tcPr>
           <w:p>
@@ -2407,7 +2407,7 @@
         </w:tc>
         <w:tc>
           <w:tcPr>
-            <w:tcW w:type="dxa" w:w="1563"/>
+            <w:tcW w:type="dxa" w:w="533"/>
             <w:vAlign w:val="center"/>
           </w:tcPr>
           <w:p>
@@ -2429,7 +2429,7 @@
         </w:tc>
         <w:tc>
           <w:tcPr>
-            <w:tcW w:type="dxa" w:w="1563"/>
+            <w:tcW w:type="dxa" w:w="533"/>
             <w:vAlign w:val="center"/>
           </w:tcPr>
           <w:p>
@@ -2456,8 +2456,8 @@
         </w:trPr>
         <w:tc>
           <w:tcPr>
-            <w:tcW w:type="dxa" w:w="1563"/>
-            <w:shd w:fill="F2F2F2"/>
+            <w:tcW w:type="dxa" w:w="518"/>
+            <w:shd w:fill="F5F5F5"/>
             <w:vAlign w:val="center"/>
           </w:tcPr>
           <w:p>
@@ -2479,8 +2479,8 @@
         </w:tc>
         <w:tc>
           <w:tcPr>
-            <w:tcW w:type="dxa" w:w="1563"/>
-            <w:shd w:fill="F2F2F2"/>
+            <w:tcW w:type="dxa" w:w="7762"/>
+            <w:shd w:fill="F5F5F5"/>
             <w:vAlign w:val="center"/>
           </w:tcPr>
           <w:p>
@@ -2502,8 +2502,8 @@
         </w:tc>
         <w:tc>
           <w:tcPr>
-            <w:tcW w:type="dxa" w:w="1563"/>
-            <w:shd w:fill="F2F2F2"/>
+            <w:tcW w:type="dxa" w:w="533"/>
+            <w:shd w:fill="F5F5F5"/>
             <w:vAlign w:val="center"/>
           </w:tcPr>
           <w:p>
@@ -2525,8 +2525,8 @@
         </w:tc>
         <w:tc>
           <w:tcPr>
-            <w:tcW w:type="dxa" w:w="1563"/>
-            <w:shd w:fill="F2F2F2"/>
+            <w:tcW w:type="dxa" w:w="533"/>
+            <w:shd w:fill="F5F5F5"/>
             <w:vAlign w:val="center"/>
           </w:tcPr>
           <w:p>
@@ -2548,8 +2548,8 @@
         </w:tc>
         <w:tc>
           <w:tcPr>
-            <w:tcW w:type="dxa" w:w="1563"/>
-            <w:shd w:fill="F2F2F2"/>
+            <w:tcW w:type="dxa" w:w="533"/>
+            <w:shd w:fill="F5F5F5"/>
             <w:vAlign w:val="center"/>
           </w:tcPr>
           <w:p>
@@ -2571,8 +2571,8 @@
         </w:tc>
         <w:tc>
           <w:tcPr>
-            <w:tcW w:type="dxa" w:w="1563"/>
-            <w:shd w:fill="F2F2F2"/>
+            <w:tcW w:type="dxa" w:w="533"/>
+            <w:shd w:fill="F5F5F5"/>
             <w:vAlign w:val="center"/>
           </w:tcPr>
           <w:p>
@@ -2594,8 +2594,8 @@
         </w:tc>
         <w:tc>
           <w:tcPr>
-            <w:tcW w:type="dxa" w:w="1563"/>
-            <w:shd w:fill="F2F2F2"/>
+            <w:tcW w:type="dxa" w:w="533"/>
+            <w:shd w:fill="F5F5F5"/>
             <w:vAlign w:val="center"/>
           </w:tcPr>
           <w:p>
@@ -2622,7 +2622,7 @@
         </w:trPr>
         <w:tc>
           <w:tcPr>
-            <w:tcW w:type="dxa" w:w="1563"/>
+            <w:tcW w:type="dxa" w:w="518"/>
             <w:vAlign w:val="center"/>
           </w:tcPr>
           <w:p>
@@ -2644,7 +2644,7 @@
         </w:tc>
         <w:tc>
           <w:tcPr>
-            <w:tcW w:type="dxa" w:w="1563"/>
+            <w:tcW w:type="dxa" w:w="7762"/>
             <w:vAlign w:val="center"/>
           </w:tcPr>
           <w:p>
@@ -2666,7 +2666,7 @@
         </w:tc>
         <w:tc>
           <w:tcPr>
-            <w:tcW w:type="dxa" w:w="1563"/>
+            <w:tcW w:type="dxa" w:w="533"/>
             <w:vAlign w:val="center"/>
           </w:tcPr>
           <w:p>
@@ -2688,7 +2688,7 @@
         </w:tc>
         <w:tc>
           <w:tcPr>
-            <w:tcW w:type="dxa" w:w="1563"/>
+            <w:tcW w:type="dxa" w:w="533"/>
             <w:vAlign w:val="center"/>
           </w:tcPr>
           <w:p>
@@ -2710,7 +2710,7 @@
         </w:tc>
         <w:tc>
           <w:tcPr>
-            <w:tcW w:type="dxa" w:w="1563"/>
+            <w:tcW w:type="dxa" w:w="533"/>
             <w:vAlign w:val="center"/>
           </w:tcPr>
           <w:p>
@@ -2732,7 +2732,7 @@
         </w:tc>
         <w:tc>
           <w:tcPr>
-            <w:tcW w:type="dxa" w:w="1563"/>
+            <w:tcW w:type="dxa" w:w="533"/>
             <w:vAlign w:val="center"/>
           </w:tcPr>
           <w:p>
@@ -2754,7 +2754,7 @@
         </w:tc>
         <w:tc>
           <w:tcPr>
-            <w:tcW w:type="dxa" w:w="1563"/>
+            <w:tcW w:type="dxa" w:w="533"/>
             <w:vAlign w:val="center"/>
           </w:tcPr>
           <w:p>
@@ -2781,8 +2781,8 @@
         </w:trPr>
         <w:tc>
           <w:tcPr>
-            <w:tcW w:type="dxa" w:w="1563"/>
-            <w:shd w:fill="F2F2F2"/>
+            <w:tcW w:type="dxa" w:w="518"/>
+            <w:shd w:fill="F5F5F5"/>
             <w:vAlign w:val="center"/>
           </w:tcPr>
           <w:p>
@@ -2804,8 +2804,8 @@
         </w:tc>
         <w:tc>
           <w:tcPr>
-            <w:tcW w:type="dxa" w:w="1563"/>
-            <w:shd w:fill="F2F2F2"/>
+            <w:tcW w:type="dxa" w:w="7762"/>
+            <w:shd w:fill="F5F5F5"/>
             <w:vAlign w:val="center"/>
           </w:tcPr>
           <w:p>
@@ -2827,8 +2827,8 @@
         </w:tc>
         <w:tc>
           <w:tcPr>
-            <w:tcW w:type="dxa" w:w="1563"/>
-            <w:shd w:fill="F2F2F2"/>
+            <w:tcW w:type="dxa" w:w="533"/>
+            <w:shd w:fill="F5F5F5"/>
             <w:vAlign w:val="center"/>
           </w:tcPr>
           <w:p>
@@ -2850,8 +2850,8 @@
         </w:tc>
         <w:tc>
           <w:tcPr>
-            <w:tcW w:type="dxa" w:w="1563"/>
-            <w:shd w:fill="F2F2F2"/>
+            <w:tcW w:type="dxa" w:w="533"/>
+            <w:shd w:fill="F5F5F5"/>
             <w:vAlign w:val="center"/>
           </w:tcPr>
           <w:p>
@@ -2873,8 +2873,8 @@
         </w:tc>
         <w:tc>
           <w:tcPr>
-            <w:tcW w:type="dxa" w:w="1563"/>
-            <w:shd w:fill="F2F2F2"/>
+            <w:tcW w:type="dxa" w:w="533"/>
+            <w:shd w:fill="F5F5F5"/>
             <w:vAlign w:val="center"/>
           </w:tcPr>
           <w:p>
@@ -2896,8 +2896,8 @@
         </w:tc>
         <w:tc>
           <w:tcPr>
-            <w:tcW w:type="dxa" w:w="1563"/>
-            <w:shd w:fill="F2F2F2"/>
+            <w:tcW w:type="dxa" w:w="533"/>
+            <w:shd w:fill="F5F5F5"/>
             <w:vAlign w:val="center"/>
           </w:tcPr>
           <w:p>
@@ -2919,8 +2919,8 @@
         </w:tc>
         <w:tc>
           <w:tcPr>
-            <w:tcW w:type="dxa" w:w="1563"/>
-            <w:shd w:fill="F2F2F2"/>
+            <w:tcW w:type="dxa" w:w="533"/>
+            <w:shd w:fill="F5F5F5"/>
             <w:vAlign w:val="center"/>
           </w:tcPr>
           <w:p>
@@ -2947,7 +2947,7 @@
         </w:trPr>
         <w:tc>
           <w:tcPr>
-            <w:tcW w:type="dxa" w:w="1563"/>
+            <w:tcW w:type="dxa" w:w="518"/>
             <w:vAlign w:val="center"/>
           </w:tcPr>
           <w:p>
@@ -2969,7 +2969,7 @@
         </w:tc>
         <w:tc>
           <w:tcPr>
-            <w:tcW w:type="dxa" w:w="1563"/>
+            <w:tcW w:type="dxa" w:w="7762"/>
             <w:vAlign w:val="center"/>
           </w:tcPr>
           <w:p>
@@ -2991,7 +2991,7 @@
         </w:tc>
         <w:tc>
           <w:tcPr>
-            <w:tcW w:type="dxa" w:w="1563"/>
+            <w:tcW w:type="dxa" w:w="533"/>
             <w:vAlign w:val="center"/>
           </w:tcPr>
           <w:p>
@@ -3013,7 +3013,7 @@
         </w:tc>
         <w:tc>
           <w:tcPr>
-            <w:tcW w:type="dxa" w:w="1563"/>
+            <w:tcW w:type="dxa" w:w="533"/>
             <w:vAlign w:val="center"/>
           </w:tcPr>
           <w:p>
@@ -3035,7 +3035,7 @@
         </w:tc>
         <w:tc>
           <w:tcPr>
-            <w:tcW w:type="dxa" w:w="1563"/>
+            <w:tcW w:type="dxa" w:w="533"/>
             <w:vAlign w:val="center"/>
           </w:tcPr>
           <w:p>
@@ -3057,7 +3057,7 @@
         </w:tc>
         <w:tc>
           <w:tcPr>
-            <w:tcW w:type="dxa" w:w="1563"/>
+            <w:tcW w:type="dxa" w:w="533"/>
             <w:vAlign w:val="center"/>
           </w:tcPr>
           <w:p>
@@ -3079,7 +3079,7 @@
         </w:tc>
         <w:tc>
           <w:tcPr>
-            <w:tcW w:type="dxa" w:w="1563"/>
+            <w:tcW w:type="dxa" w:w="533"/>
             <w:vAlign w:val="center"/>
           </w:tcPr>
           <w:p>
@@ -3106,8 +3106,8 @@
         </w:trPr>
         <w:tc>
           <w:tcPr>
-            <w:tcW w:type="dxa" w:w="1563"/>
-            <w:shd w:fill="F2F2F2"/>
+            <w:tcW w:type="dxa" w:w="518"/>
+            <w:shd w:fill="F5F5F5"/>
             <w:vAlign w:val="center"/>
           </w:tcPr>
           <w:p>
@@ -3129,8 +3129,8 @@
         </w:tc>
         <w:tc>
           <w:tcPr>
-            <w:tcW w:type="dxa" w:w="1563"/>
-            <w:shd w:fill="F2F2F2"/>
+            <w:tcW w:type="dxa" w:w="7762"/>
+            <w:shd w:fill="F5F5F5"/>
             <w:vAlign w:val="center"/>
           </w:tcPr>
           <w:p>
@@ -3152,8 +3152,8 @@
         </w:tc>
         <w:tc>
           <w:tcPr>
-            <w:tcW w:type="dxa" w:w="1563"/>
-            <w:shd w:fill="F2F2F2"/>
+            <w:tcW w:type="dxa" w:w="533"/>
+            <w:shd w:fill="F5F5F5"/>
             <w:vAlign w:val="center"/>
           </w:tcPr>
           <w:p>
@@ -3175,8 +3175,8 @@
         </w:tc>
         <w:tc>
           <w:tcPr>
-            <w:tcW w:type="dxa" w:w="1563"/>
-            <w:shd w:fill="F2F2F2"/>
+            <w:tcW w:type="dxa" w:w="533"/>
+            <w:shd w:fill="F5F5F5"/>
             <w:vAlign w:val="center"/>
           </w:tcPr>
           <w:p>
@@ -3198,8 +3198,8 @@
         </w:tc>
         <w:tc>
           <w:tcPr>
-            <w:tcW w:type="dxa" w:w="1563"/>
-            <w:shd w:fill="F2F2F2"/>
+            <w:tcW w:type="dxa" w:w="533"/>
+            <w:shd w:fill="F5F5F5"/>
             <w:vAlign w:val="center"/>
           </w:tcPr>
           <w:p>
@@ -3221,8 +3221,8 @@
         </w:tc>
         <w:tc>
           <w:tcPr>
-            <w:tcW w:type="dxa" w:w="1563"/>
-            <w:shd w:fill="F2F2F2"/>
+            <w:tcW w:type="dxa" w:w="533"/>
+            <w:shd w:fill="F5F5F5"/>
             <w:vAlign w:val="center"/>
           </w:tcPr>
           <w:p>
@@ -3244,8 +3244,8 @@
         </w:tc>
         <w:tc>
           <w:tcPr>
-            <w:tcW w:type="dxa" w:w="1563"/>
-            <w:shd w:fill="F2F2F2"/>
+            <w:tcW w:type="dxa" w:w="533"/>
+            <w:shd w:fill="F5F5F5"/>
             <w:vAlign w:val="center"/>
           </w:tcPr>
           <w:p>
@@ -3272,7 +3272,7 @@
         </w:trPr>
         <w:tc>
           <w:tcPr>
-            <w:tcW w:type="dxa" w:w="1563"/>
+            <w:tcW w:type="dxa" w:w="518"/>
             <w:vAlign w:val="center"/>
           </w:tcPr>
           <w:p>
@@ -3294,7 +3294,7 @@
         </w:tc>
         <w:tc>
           <w:tcPr>
-            <w:tcW w:type="dxa" w:w="1563"/>
+            <w:tcW w:type="dxa" w:w="7762"/>
             <w:vAlign w:val="center"/>
           </w:tcPr>
           <w:p>
@@ -3316,7 +3316,7 @@
         </w:tc>
         <w:tc>
           <w:tcPr>
-            <w:tcW w:type="dxa" w:w="1563"/>
+            <w:tcW w:type="dxa" w:w="533"/>
             <w:vAlign w:val="center"/>
           </w:tcPr>
           <w:p>
@@ -3338,7 +3338,7 @@
         </w:tc>
         <w:tc>
           <w:tcPr>
-            <w:tcW w:type="dxa" w:w="1563"/>
+            <w:tcW w:type="dxa" w:w="533"/>
             <w:vAlign w:val="center"/>
           </w:tcPr>
           <w:p>
@@ -3360,7 +3360,7 @@
         </w:tc>
         <w:tc>
           <w:tcPr>
-            <w:tcW w:type="dxa" w:w="1563"/>
+            <w:tcW w:type="dxa" w:w="533"/>
             <w:vAlign w:val="center"/>
           </w:tcPr>
           <w:p>
@@ -3382,7 +3382,7 @@
         </w:tc>
         <w:tc>
           <w:tcPr>
-            <w:tcW w:type="dxa" w:w="1563"/>
+            <w:tcW w:type="dxa" w:w="533"/>
             <w:vAlign w:val="center"/>
           </w:tcPr>
           <w:p>
@@ -3404,7 +3404,7 @@
         </w:tc>
         <w:tc>
           <w:tcPr>
-            <w:tcW w:type="dxa" w:w="1563"/>
+            <w:tcW w:type="dxa" w:w="533"/>
             <w:vAlign w:val="center"/>
           </w:tcPr>
           <w:p>
@@ -3431,8 +3431,8 @@
         </w:trPr>
         <w:tc>
           <w:tcPr>
-            <w:tcW w:type="dxa" w:w="1563"/>
-            <w:shd w:fill="F2F2F2"/>
+            <w:tcW w:type="dxa" w:w="518"/>
+            <w:shd w:fill="F5F5F5"/>
             <w:vAlign w:val="center"/>
           </w:tcPr>
           <w:p>
@@ -3454,8 +3454,8 @@
         </w:tc>
         <w:tc>
           <w:tcPr>
-            <w:tcW w:type="dxa" w:w="1563"/>
-            <w:shd w:fill="F2F2F2"/>
+            <w:tcW w:type="dxa" w:w="7762"/>
+            <w:shd w:fill="F5F5F5"/>
             <w:vAlign w:val="center"/>
           </w:tcPr>
           <w:p>
@@ -3477,8 +3477,8 @@
         </w:tc>
         <w:tc>
           <w:tcPr>
-            <w:tcW w:type="dxa" w:w="1563"/>
-            <w:shd w:fill="F2F2F2"/>
+            <w:tcW w:type="dxa" w:w="533"/>
+            <w:shd w:fill="F5F5F5"/>
             <w:vAlign w:val="center"/>
           </w:tcPr>
           <w:p>
@@ -3500,8 +3500,8 @@
         </w:tc>
         <w:tc>
           <w:tcPr>
-            <w:tcW w:type="dxa" w:w="1563"/>
-            <w:shd w:fill="F2F2F2"/>
+            <w:tcW w:type="dxa" w:w="533"/>
+            <w:shd w:fill="F5F5F5"/>
             <w:vAlign w:val="center"/>
           </w:tcPr>
           <w:p>
@@ -3523,8 +3523,8 @@
         </w:tc>
         <w:tc>
           <w:tcPr>
-            <w:tcW w:type="dxa" w:w="1563"/>
-            <w:shd w:fill="F2F2F2"/>
+            <w:tcW w:type="dxa" w:w="533"/>
+            <w:shd w:fill="F5F5F5"/>
             <w:vAlign w:val="center"/>
           </w:tcPr>
           <w:p>
@@ -3546,8 +3546,8 @@
         </w:tc>
         <w:tc>
           <w:tcPr>
-            <w:tcW w:type="dxa" w:w="1563"/>
-            <w:shd w:fill="F2F2F2"/>
+            <w:tcW w:type="dxa" w:w="533"/>
+            <w:shd w:fill="F5F5F5"/>
             <w:vAlign w:val="center"/>
           </w:tcPr>
           <w:p>
@@ -3569,8 +3569,8 @@
         </w:tc>
         <w:tc>
           <w:tcPr>
-            <w:tcW w:type="dxa" w:w="1563"/>
-            <w:shd w:fill="F2F2F2"/>
+            <w:tcW w:type="dxa" w:w="533"/>
+            <w:shd w:fill="F5F5F5"/>
             <w:vAlign w:val="center"/>
           </w:tcPr>
           <w:p>
@@ -3646,10 +3646,10 @@
         </w:trPr>
         <w:tc>
           <w:tcPr>
-            <w:tcW w:type="dxa" w:w="1563"/>
+            <w:tcW w:type="dxa" w:w="518"/>
             <w:vMerge w:val="restart"/>
             <w:vAlign w:val="center"/>
-            <w:shd w:fill="000000"/>
+            <w:shd w:fill="D9D9D9"/>
           </w:tcPr>
           <w:p>
             <w:pPr>
@@ -3661,7 +3661,7 @@
               <w:rPr>
                 <w:rFonts w:ascii="Arial" w:hAnsi="Arial"/>
                 <w:b/>
-                <w:color w:val="FFFFFF"/>
+                <w:color w:val="111111"/>
                 <w:sz w:val="15"/>
               </w:rPr>
               <w:t>NO.</w:t>
@@ -3670,10 +3670,10 @@
         </w:tc>
         <w:tc>
           <w:tcPr>
-            <w:tcW w:type="dxa" w:w="1563"/>
+            <w:tcW w:type="dxa" w:w="7762"/>
             <w:vMerge w:val="restart"/>
             <w:vAlign w:val="center"/>
-            <w:shd w:fill="000000"/>
+            <w:shd w:fill="D9D9D9"/>
           </w:tcPr>
           <w:p>
             <w:pPr>
@@ -3685,7 +3685,7 @@
               <w:rPr>
                 <w:rFonts w:ascii="Arial" w:hAnsi="Arial"/>
                 <w:b/>
-                <w:color w:val="FFFFFF"/>
+                <w:color w:val="111111"/>
                 <w:sz w:val="15"/>
               </w:rPr>
               <w:t>STATEMENTS</w:t>
@@ -3694,10 +3694,10 @@
         </w:tc>
         <w:tc>
           <w:tcPr>
-            <w:tcW w:type="dxa" w:w="7815"/>
+            <w:tcW w:type="dxa" w:w="2664"/>
             <w:gridSpan w:val="5"/>
             <w:vAlign w:val="center"/>
-            <w:shd w:fill="000000"/>
+            <w:shd w:fill="D9D9D9"/>
           </w:tcPr>
           <w:p>
             <w:pPr>
@@ -3709,7 +3709,7 @@
               <w:rPr>
                 <w:rFonts w:ascii="Arial" w:hAnsi="Arial"/>
                 <w:b/>
-                <w:color w:val="FFFFFF"/>
+                <w:color w:val="111111"/>
                 <w:sz w:val="15"/>
               </w:rPr>
               <w:t>LEVEL OF AGREEMENT</w:t>
@@ -3738,9 +3738,9 @@
         </w:tc>
         <w:tc>
           <w:tcPr>
-            <w:tcW w:type="dxa" w:w="1563"/>
-            <w:vAlign w:val="center"/>
-            <w:shd w:fill="000000"/>
+            <w:tcW w:type="dxa" w:w="533"/>
+            <w:vAlign w:val="center"/>
+            <w:shd w:fill="D9D9D9"/>
           </w:tcPr>
           <w:p>
             <w:pPr>
@@ -3752,7 +3752,7 @@
               <w:rPr>
                 <w:rFonts w:ascii="Arial" w:hAnsi="Arial"/>
                 <w:b/>
-                <w:color w:val="FFFFFF"/>
+                <w:color w:val="111111"/>
                 <w:sz w:val="15"/>
               </w:rPr>
               <w:t>5</w:t>
@@ -3761,9 +3761,9 @@
         </w:tc>
         <w:tc>
           <w:tcPr>
-            <w:tcW w:type="dxa" w:w="1563"/>
-            <w:vAlign w:val="center"/>
-            <w:shd w:fill="000000"/>
+            <w:tcW w:type="dxa" w:w="533"/>
+            <w:vAlign w:val="center"/>
+            <w:shd w:fill="D9D9D9"/>
           </w:tcPr>
           <w:p>
             <w:pPr>
@@ -3775,7 +3775,7 @@
               <w:rPr>
                 <w:rFonts w:ascii="Arial" w:hAnsi="Arial"/>
                 <w:b/>
-                <w:color w:val="FFFFFF"/>
+                <w:color w:val="111111"/>
                 <w:sz w:val="15"/>
               </w:rPr>
               <w:t>4</w:t>
@@ -3784,9 +3784,9 @@
         </w:tc>
         <w:tc>
           <w:tcPr>
-            <w:tcW w:type="dxa" w:w="1563"/>
-            <w:vAlign w:val="center"/>
-            <w:shd w:fill="000000"/>
+            <w:tcW w:type="dxa" w:w="533"/>
+            <w:vAlign w:val="center"/>
+            <w:shd w:fill="D9D9D9"/>
           </w:tcPr>
           <w:p>
             <w:pPr>
@@ -3798,7 +3798,7 @@
               <w:rPr>
                 <w:rFonts w:ascii="Arial" w:hAnsi="Arial"/>
                 <w:b/>
-                <w:color w:val="FFFFFF"/>
+                <w:color w:val="111111"/>
                 <w:sz w:val="15"/>
               </w:rPr>
               <w:t>3</w:t>
@@ -3807,9 +3807,9 @@
         </w:tc>
         <w:tc>
           <w:tcPr>
-            <w:tcW w:type="dxa" w:w="1563"/>
-            <w:vAlign w:val="center"/>
-            <w:shd w:fill="000000"/>
+            <w:tcW w:type="dxa" w:w="533"/>
+            <w:vAlign w:val="center"/>
+            <w:shd w:fill="D9D9D9"/>
           </w:tcPr>
           <w:p>
             <w:pPr>
@@ -3821,7 +3821,7 @@
               <w:rPr>
                 <w:rFonts w:ascii="Arial" w:hAnsi="Arial"/>
                 <w:b/>
-                <w:color w:val="FFFFFF"/>
+                <w:color w:val="111111"/>
                 <w:sz w:val="15"/>
               </w:rPr>
               <w:t>2</w:t>
@@ -3830,9 +3830,9 @@
         </w:tc>
         <w:tc>
           <w:tcPr>
-            <w:tcW w:type="dxa" w:w="1563"/>
-            <w:vAlign w:val="center"/>
-            <w:shd w:fill="000000"/>
+            <w:tcW w:type="dxa" w:w="533"/>
+            <w:vAlign w:val="center"/>
+            <w:shd w:fill="D9D9D9"/>
           </w:tcPr>
           <w:p>
             <w:pPr>
@@ -3844,7 +3844,7 @@
               <w:rPr>
                 <w:rFonts w:ascii="Arial" w:hAnsi="Arial"/>
                 <w:b/>
-                <w:color w:val="FFFFFF"/>
+                <w:color w:val="111111"/>
                 <w:sz w:val="15"/>
               </w:rPr>
               <w:t>1</w:t>
@@ -3858,7 +3858,7 @@
         </w:trPr>
         <w:tc>
           <w:tcPr>
-            <w:tcW w:type="dxa" w:w="1563"/>
+            <w:tcW w:type="dxa" w:w="518"/>
             <w:vAlign w:val="center"/>
           </w:tcPr>
           <w:p>
@@ -3880,7 +3880,7 @@
         </w:tc>
         <w:tc>
           <w:tcPr>
-            <w:tcW w:type="dxa" w:w="1563"/>
+            <w:tcW w:type="dxa" w:w="7762"/>
             <w:vAlign w:val="center"/>
           </w:tcPr>
           <w:p>
@@ -3902,7 +3902,7 @@
         </w:tc>
         <w:tc>
           <w:tcPr>
-            <w:tcW w:type="dxa" w:w="1563"/>
+            <w:tcW w:type="dxa" w:w="533"/>
             <w:vAlign w:val="center"/>
           </w:tcPr>
           <w:p>
@@ -3924,7 +3924,7 @@
         </w:tc>
         <w:tc>
           <w:tcPr>
-            <w:tcW w:type="dxa" w:w="1563"/>
+            <w:tcW w:type="dxa" w:w="533"/>
             <w:vAlign w:val="center"/>
           </w:tcPr>
           <w:p>
@@ -3946,7 +3946,7 @@
         </w:tc>
         <w:tc>
           <w:tcPr>
-            <w:tcW w:type="dxa" w:w="1563"/>
+            <w:tcW w:type="dxa" w:w="533"/>
             <w:vAlign w:val="center"/>
           </w:tcPr>
           <w:p>
@@ -3968,7 +3968,7 @@
         </w:tc>
         <w:tc>
           <w:tcPr>
-            <w:tcW w:type="dxa" w:w="1563"/>
+            <w:tcW w:type="dxa" w:w="533"/>
             <w:vAlign w:val="center"/>
           </w:tcPr>
           <w:p>
@@ -3990,7 +3990,7 @@
         </w:tc>
         <w:tc>
           <w:tcPr>
-            <w:tcW w:type="dxa" w:w="1563"/>
+            <w:tcW w:type="dxa" w:w="533"/>
             <w:vAlign w:val="center"/>
           </w:tcPr>
           <w:p>
@@ -4017,8 +4017,8 @@
         </w:trPr>
         <w:tc>
           <w:tcPr>
-            <w:tcW w:type="dxa" w:w="1563"/>
-            <w:shd w:fill="F2F2F2"/>
+            <w:tcW w:type="dxa" w:w="518"/>
+            <w:shd w:fill="F5F5F5"/>
             <w:vAlign w:val="center"/>
           </w:tcPr>
           <w:p>
@@ -4040,8 +4040,8 @@
         </w:tc>
         <w:tc>
           <w:tcPr>
-            <w:tcW w:type="dxa" w:w="1563"/>
-            <w:shd w:fill="F2F2F2"/>
+            <w:tcW w:type="dxa" w:w="7762"/>
+            <w:shd w:fill="F5F5F5"/>
             <w:vAlign w:val="center"/>
           </w:tcPr>
           <w:p>
@@ -4063,8 +4063,8 @@
         </w:tc>
         <w:tc>
           <w:tcPr>
-            <w:tcW w:type="dxa" w:w="1563"/>
-            <w:shd w:fill="F2F2F2"/>
+            <w:tcW w:type="dxa" w:w="533"/>
+            <w:shd w:fill="F5F5F5"/>
             <w:vAlign w:val="center"/>
           </w:tcPr>
           <w:p>
@@ -4086,8 +4086,8 @@
         </w:tc>
         <w:tc>
           <w:tcPr>
-            <w:tcW w:type="dxa" w:w="1563"/>
-            <w:shd w:fill="F2F2F2"/>
+            <w:tcW w:type="dxa" w:w="533"/>
+            <w:shd w:fill="F5F5F5"/>
             <w:vAlign w:val="center"/>
           </w:tcPr>
           <w:p>
@@ -4109,8 +4109,8 @@
         </w:tc>
         <w:tc>
           <w:tcPr>
-            <w:tcW w:type="dxa" w:w="1563"/>
-            <w:shd w:fill="F2F2F2"/>
+            <w:tcW w:type="dxa" w:w="533"/>
+            <w:shd w:fill="F5F5F5"/>
             <w:vAlign w:val="center"/>
           </w:tcPr>
           <w:p>
@@ -4132,8 +4132,8 @@
         </w:tc>
         <w:tc>
           <w:tcPr>
-            <w:tcW w:type="dxa" w:w="1563"/>
-            <w:shd w:fill="F2F2F2"/>
+            <w:tcW w:type="dxa" w:w="533"/>
+            <w:shd w:fill="F5F5F5"/>
             <w:vAlign w:val="center"/>
           </w:tcPr>
           <w:p>
@@ -4155,8 +4155,8 @@
         </w:tc>
         <w:tc>
           <w:tcPr>
-            <w:tcW w:type="dxa" w:w="1563"/>
-            <w:shd w:fill="F2F2F2"/>
+            <w:tcW w:type="dxa" w:w="533"/>
+            <w:shd w:fill="F5F5F5"/>
             <w:vAlign w:val="center"/>
           </w:tcPr>
           <w:p>
@@ -4183,7 +4183,7 @@
         </w:trPr>
         <w:tc>
           <w:tcPr>
-            <w:tcW w:type="dxa" w:w="1563"/>
+            <w:tcW w:type="dxa" w:w="518"/>
             <w:vAlign w:val="center"/>
           </w:tcPr>
           <w:p>
@@ -4205,7 +4205,7 @@
         </w:tc>
         <w:tc>
           <w:tcPr>
-            <w:tcW w:type="dxa" w:w="1563"/>
+            <w:tcW w:type="dxa" w:w="7762"/>
             <w:vAlign w:val="center"/>
           </w:tcPr>
           <w:p>
@@ -4227,7 +4227,7 @@
         </w:tc>
         <w:tc>
           <w:tcPr>
-            <w:tcW w:type="dxa" w:w="1563"/>
+            <w:tcW w:type="dxa" w:w="533"/>
             <w:vAlign w:val="center"/>
           </w:tcPr>
           <w:p>
@@ -4249,7 +4249,7 @@
         </w:tc>
         <w:tc>
           <w:tcPr>
-            <w:tcW w:type="dxa" w:w="1563"/>
+            <w:tcW w:type="dxa" w:w="533"/>
             <w:vAlign w:val="center"/>
           </w:tcPr>
           <w:p>
@@ -4271,7 +4271,7 @@
         </w:tc>
         <w:tc>
           <w:tcPr>
-            <w:tcW w:type="dxa" w:w="1563"/>
+            <w:tcW w:type="dxa" w:w="533"/>
             <w:vAlign w:val="center"/>
           </w:tcPr>
           <w:p>
@@ -4293,7 +4293,7 @@
         </w:tc>
         <w:tc>
           <w:tcPr>
-            <w:tcW w:type="dxa" w:w="1563"/>
+            <w:tcW w:type="dxa" w:w="533"/>
             <w:vAlign w:val="center"/>
           </w:tcPr>
           <w:p>
@@ -4315,7 +4315,7 @@
         </w:tc>
         <w:tc>
           <w:tcPr>
-            <w:tcW w:type="dxa" w:w="1563"/>
+            <w:tcW w:type="dxa" w:w="533"/>
             <w:vAlign w:val="center"/>
           </w:tcPr>
           <w:p>
@@ -4342,8 +4342,8 @@
         </w:trPr>
         <w:tc>
           <w:tcPr>
-            <w:tcW w:type="dxa" w:w="1563"/>
-            <w:shd w:fill="F2F2F2"/>
+            <w:tcW w:type="dxa" w:w="518"/>
+            <w:shd w:fill="F5F5F5"/>
             <w:vAlign w:val="center"/>
           </w:tcPr>
           <w:p>
@@ -4365,8 +4365,8 @@
         </w:tc>
         <w:tc>
           <w:tcPr>
-            <w:tcW w:type="dxa" w:w="1563"/>
-            <w:shd w:fill="F2F2F2"/>
+            <w:tcW w:type="dxa" w:w="7762"/>
+            <w:shd w:fill="F5F5F5"/>
             <w:vAlign w:val="center"/>
           </w:tcPr>
           <w:p>
@@ -4388,8 +4388,8 @@
         </w:tc>
         <w:tc>
           <w:tcPr>
-            <w:tcW w:type="dxa" w:w="1563"/>
-            <w:shd w:fill="F2F2F2"/>
+            <w:tcW w:type="dxa" w:w="533"/>
+            <w:shd w:fill="F5F5F5"/>
             <w:vAlign w:val="center"/>
           </w:tcPr>
           <w:p>
@@ -4411,8 +4411,8 @@
         </w:tc>
         <w:tc>
           <w:tcPr>
-            <w:tcW w:type="dxa" w:w="1563"/>
-            <w:shd w:fill="F2F2F2"/>
+            <w:tcW w:type="dxa" w:w="533"/>
+            <w:shd w:fill="F5F5F5"/>
             <w:vAlign w:val="center"/>
           </w:tcPr>
           <w:p>
@@ -4434,8 +4434,8 @@
         </w:tc>
         <w:tc>
           <w:tcPr>
-            <w:tcW w:type="dxa" w:w="1563"/>
-            <w:shd w:fill="F2F2F2"/>
+            <w:tcW w:type="dxa" w:w="533"/>
+            <w:shd w:fill="F5F5F5"/>
             <w:vAlign w:val="center"/>
           </w:tcPr>
           <w:p>
@@ -4457,8 +4457,8 @@
         </w:tc>
         <w:tc>
           <w:tcPr>
-            <w:tcW w:type="dxa" w:w="1563"/>
-            <w:shd w:fill="F2F2F2"/>
+            <w:tcW w:type="dxa" w:w="533"/>
+            <w:shd w:fill="F5F5F5"/>
             <w:vAlign w:val="center"/>
           </w:tcPr>
           <w:p>
@@ -4480,8 +4480,8 @@
         </w:tc>
         <w:tc>
           <w:tcPr>
-            <w:tcW w:type="dxa" w:w="1563"/>
-            <w:shd w:fill="F2F2F2"/>
+            <w:tcW w:type="dxa" w:w="533"/>
+            <w:shd w:fill="F5F5F5"/>
             <w:vAlign w:val="center"/>
           </w:tcPr>
           <w:p>
@@ -4508,7 +4508,7 @@
         </w:trPr>
         <w:tc>
           <w:tcPr>
-            <w:tcW w:type="dxa" w:w="1563"/>
+            <w:tcW w:type="dxa" w:w="518"/>
             <w:vAlign w:val="center"/>
           </w:tcPr>
           <w:p>
@@ -4530,7 +4530,7 @@
         </w:tc>
         <w:tc>
           <w:tcPr>
-            <w:tcW w:type="dxa" w:w="1563"/>
+            <w:tcW w:type="dxa" w:w="7762"/>
             <w:vAlign w:val="center"/>
           </w:tcPr>
           <w:p>
@@ -4552,7 +4552,7 @@
         </w:tc>
         <w:tc>
           <w:tcPr>
-            <w:tcW w:type="dxa" w:w="1563"/>
+            <w:tcW w:type="dxa" w:w="533"/>
             <w:vAlign w:val="center"/>
           </w:tcPr>
           <w:p>
@@ -4574,7 +4574,7 @@
         </w:tc>
         <w:tc>
           <w:tcPr>
-            <w:tcW w:type="dxa" w:w="1563"/>
+            <w:tcW w:type="dxa" w:w="533"/>
             <w:vAlign w:val="center"/>
           </w:tcPr>
           <w:p>
@@ -4596,7 +4596,7 @@
         </w:tc>
         <w:tc>
           <w:tcPr>
-            <w:tcW w:type="dxa" w:w="1563"/>
+            <w:tcW w:type="dxa" w:w="533"/>
             <w:vAlign w:val="center"/>
           </w:tcPr>
           <w:p>
@@ -4618,7 +4618,7 @@
         </w:tc>
         <w:tc>
           <w:tcPr>
-            <w:tcW w:type="dxa" w:w="1563"/>
+            <w:tcW w:type="dxa" w:w="533"/>
             <w:vAlign w:val="center"/>
           </w:tcPr>
           <w:p>
@@ -4640,7 +4640,7 @@
         </w:tc>
         <w:tc>
           <w:tcPr>
-            <w:tcW w:type="dxa" w:w="1563"/>
+            <w:tcW w:type="dxa" w:w="533"/>
             <w:vAlign w:val="center"/>
           </w:tcPr>
           <w:p>
@@ -4667,8 +4667,8 @@
         </w:trPr>
         <w:tc>
           <w:tcPr>
-            <w:tcW w:type="dxa" w:w="1563"/>
-            <w:shd w:fill="F2F2F2"/>
+            <w:tcW w:type="dxa" w:w="518"/>
+            <w:shd w:fill="F5F5F5"/>
             <w:vAlign w:val="center"/>
           </w:tcPr>
           <w:p>
@@ -4690,8 +4690,8 @@
         </w:tc>
         <w:tc>
           <w:tcPr>
-            <w:tcW w:type="dxa" w:w="1563"/>
-            <w:shd w:fill="F2F2F2"/>
+            <w:tcW w:type="dxa" w:w="7762"/>
+            <w:shd w:fill="F5F5F5"/>
             <w:vAlign w:val="center"/>
           </w:tcPr>
           <w:p>
@@ -4713,8 +4713,8 @@
         </w:tc>
         <w:tc>
           <w:tcPr>
-            <w:tcW w:type="dxa" w:w="1563"/>
-            <w:shd w:fill="F2F2F2"/>
+            <w:tcW w:type="dxa" w:w="533"/>
+            <w:shd w:fill="F5F5F5"/>
             <w:vAlign w:val="center"/>
           </w:tcPr>
           <w:p>
@@ -4736,8 +4736,8 @@
         </w:tc>
         <w:tc>
           <w:tcPr>
-            <w:tcW w:type="dxa" w:w="1563"/>
-            <w:shd w:fill="F2F2F2"/>
+            <w:tcW w:type="dxa" w:w="533"/>
+            <w:shd w:fill="F5F5F5"/>
             <w:vAlign w:val="center"/>
           </w:tcPr>
           <w:p>
@@ -4759,8 +4759,8 @@
         </w:tc>
         <w:tc>
           <w:tcPr>
-            <w:tcW w:type="dxa" w:w="1563"/>
-            <w:shd w:fill="F2F2F2"/>
+            <w:tcW w:type="dxa" w:w="533"/>
+            <w:shd w:fill="F5F5F5"/>
             <w:vAlign w:val="center"/>
           </w:tcPr>
           <w:p>
@@ -4782,8 +4782,8 @@
         </w:tc>
         <w:tc>
           <w:tcPr>
-            <w:tcW w:type="dxa" w:w="1563"/>
-            <w:shd w:fill="F2F2F2"/>
+            <w:tcW w:type="dxa" w:w="533"/>
+            <w:shd w:fill="F5F5F5"/>
             <w:vAlign w:val="center"/>
           </w:tcPr>
           <w:p>
@@ -4805,8 +4805,8 @@
         </w:tc>
         <w:tc>
           <w:tcPr>
-            <w:tcW w:type="dxa" w:w="1563"/>
-            <w:shd w:fill="F2F2F2"/>
+            <w:tcW w:type="dxa" w:w="533"/>
+            <w:shd w:fill="F5F5F5"/>
             <w:vAlign w:val="center"/>
           </w:tcPr>
           <w:p>
@@ -4833,7 +4833,7 @@
         </w:trPr>
         <w:tc>
           <w:tcPr>
-            <w:tcW w:type="dxa" w:w="1563"/>
+            <w:tcW w:type="dxa" w:w="518"/>
             <w:vAlign w:val="center"/>
           </w:tcPr>
           <w:p>
@@ -4855,7 +4855,7 @@
         </w:tc>
         <w:tc>
           <w:tcPr>
-            <w:tcW w:type="dxa" w:w="1563"/>
+            <w:tcW w:type="dxa" w:w="7762"/>
             <w:vAlign w:val="center"/>
           </w:tcPr>
           <w:p>
@@ -4877,7 +4877,7 @@
         </w:tc>
         <w:tc>
           <w:tcPr>
-            <w:tcW w:type="dxa" w:w="1563"/>
+            <w:tcW w:type="dxa" w:w="533"/>
             <w:vAlign w:val="center"/>
           </w:tcPr>
           <w:p>
@@ -4899,7 +4899,7 @@
         </w:tc>
         <w:tc>
           <w:tcPr>
-            <w:tcW w:type="dxa" w:w="1563"/>
+            <w:tcW w:type="dxa" w:w="533"/>
             <w:vAlign w:val="center"/>
           </w:tcPr>
           <w:p>
@@ -4921,7 +4921,7 @@
         </w:tc>
         <w:tc>
           <w:tcPr>
-            <w:tcW w:type="dxa" w:w="1563"/>
+            <w:tcW w:type="dxa" w:w="533"/>
             <w:vAlign w:val="center"/>
           </w:tcPr>
           <w:p>
@@ -4943,7 +4943,7 @@
         </w:tc>
         <w:tc>
           <w:tcPr>
-            <w:tcW w:type="dxa" w:w="1563"/>
+            <w:tcW w:type="dxa" w:w="533"/>
             <w:vAlign w:val="center"/>
           </w:tcPr>
           <w:p>
@@ -4965,7 +4965,7 @@
         </w:tc>
         <w:tc>
           <w:tcPr>
-            <w:tcW w:type="dxa" w:w="1563"/>
+            <w:tcW w:type="dxa" w:w="533"/>
             <w:vAlign w:val="center"/>
           </w:tcPr>
           <w:p>
@@ -4992,8 +4992,8 @@
         </w:trPr>
         <w:tc>
           <w:tcPr>
-            <w:tcW w:type="dxa" w:w="1563"/>
-            <w:shd w:fill="F2F2F2"/>
+            <w:tcW w:type="dxa" w:w="518"/>
+            <w:shd w:fill="F5F5F5"/>
             <w:vAlign w:val="center"/>
           </w:tcPr>
           <w:p>
@@ -5015,8 +5015,8 @@
         </w:tc>
         <w:tc>
           <w:tcPr>
-            <w:tcW w:type="dxa" w:w="1563"/>
-            <w:shd w:fill="F2F2F2"/>
+            <w:tcW w:type="dxa" w:w="7762"/>
+            <w:shd w:fill="F5F5F5"/>
             <w:vAlign w:val="center"/>
           </w:tcPr>
           <w:p>
@@ -5038,8 +5038,8 @@
         </w:tc>
         <w:tc>
           <w:tcPr>
-            <w:tcW w:type="dxa" w:w="1563"/>
-            <w:shd w:fill="F2F2F2"/>
+            <w:tcW w:type="dxa" w:w="533"/>
+            <w:shd w:fill="F5F5F5"/>
             <w:vAlign w:val="center"/>
           </w:tcPr>
           <w:p>
@@ -5061,8 +5061,8 @@
         </w:tc>
         <w:tc>
           <w:tcPr>
-            <w:tcW w:type="dxa" w:w="1563"/>
-            <w:shd w:fill="F2F2F2"/>
+            <w:tcW w:type="dxa" w:w="533"/>
+            <w:shd w:fill="F5F5F5"/>
             <w:vAlign w:val="center"/>
           </w:tcPr>
           <w:p>
@@ -5084,8 +5084,8 @@
         </w:tc>
         <w:tc>
           <w:tcPr>
-            <w:tcW w:type="dxa" w:w="1563"/>
-            <w:shd w:fill="F2F2F2"/>
+            <w:tcW w:type="dxa" w:w="533"/>
+            <w:shd w:fill="F5F5F5"/>
             <w:vAlign w:val="center"/>
           </w:tcPr>
           <w:p>
@@ -5107,8 +5107,8 @@
         </w:tc>
         <w:tc>
           <w:tcPr>
-            <w:tcW w:type="dxa" w:w="1563"/>
-            <w:shd w:fill="F2F2F2"/>
+            <w:tcW w:type="dxa" w:w="533"/>
+            <w:shd w:fill="F5F5F5"/>
             <w:vAlign w:val="center"/>
           </w:tcPr>
           <w:p>
@@ -5130,8 +5130,8 @@
         </w:tc>
         <w:tc>
           <w:tcPr>
-            <w:tcW w:type="dxa" w:w="1563"/>
-            <w:shd w:fill="F2F2F2"/>
+            <w:tcW w:type="dxa" w:w="533"/>
+            <w:shd w:fill="F5F5F5"/>
             <w:vAlign w:val="center"/>
           </w:tcPr>
           <w:p>
@@ -5207,10 +5207,10 @@
         </w:trPr>
         <w:tc>
           <w:tcPr>
-            <w:tcW w:type="dxa" w:w="1563"/>
+            <w:tcW w:type="dxa" w:w="518"/>
             <w:vMerge w:val="restart"/>
             <w:vAlign w:val="center"/>
-            <w:shd w:fill="000000"/>
+            <w:shd w:fill="D9D9D9"/>
           </w:tcPr>
           <w:p>
             <w:pPr>
@@ -5222,7 +5222,7 @@
               <w:rPr>
                 <w:rFonts w:ascii="Arial" w:hAnsi="Arial"/>
                 <w:b/>
-                <w:color w:val="FFFFFF"/>
+                <w:color w:val="111111"/>
                 <w:sz w:val="15"/>
               </w:rPr>
               <w:t>NO.</w:t>
@@ -5231,10 +5231,10 @@
         </w:tc>
         <w:tc>
           <w:tcPr>
-            <w:tcW w:type="dxa" w:w="1563"/>
+            <w:tcW w:type="dxa" w:w="7762"/>
             <w:vMerge w:val="restart"/>
             <w:vAlign w:val="center"/>
-            <w:shd w:fill="000000"/>
+            <w:shd w:fill="D9D9D9"/>
           </w:tcPr>
           <w:p>
             <w:pPr>
@@ -5246,7 +5246,7 @@
               <w:rPr>
                 <w:rFonts w:ascii="Arial" w:hAnsi="Arial"/>
                 <w:b/>
-                <w:color w:val="FFFFFF"/>
+                <w:color w:val="111111"/>
                 <w:sz w:val="15"/>
               </w:rPr>
               <w:t>STATEMENTS</w:t>
@@ -5255,10 +5255,10 @@
         </w:tc>
         <w:tc>
           <w:tcPr>
-            <w:tcW w:type="dxa" w:w="7815"/>
+            <w:tcW w:type="dxa" w:w="2664"/>
             <w:gridSpan w:val="5"/>
             <w:vAlign w:val="center"/>
-            <w:shd w:fill="000000"/>
+            <w:shd w:fill="D9D9D9"/>
           </w:tcPr>
           <w:p>
             <w:pPr>
@@ -5270,7 +5270,7 @@
               <w:rPr>
                 <w:rFonts w:ascii="Arial" w:hAnsi="Arial"/>
                 <w:b/>
-                <w:color w:val="FFFFFF"/>
+                <w:color w:val="111111"/>
                 <w:sz w:val="15"/>
               </w:rPr>
               <w:t>LEVEL OF AGREEMENT</w:t>
@@ -5299,9 +5299,9 @@
         </w:tc>
         <w:tc>
           <w:tcPr>
-            <w:tcW w:type="dxa" w:w="1563"/>
-            <w:vAlign w:val="center"/>
-            <w:shd w:fill="000000"/>
+            <w:tcW w:type="dxa" w:w="533"/>
+            <w:vAlign w:val="center"/>
+            <w:shd w:fill="D9D9D9"/>
           </w:tcPr>
           <w:p>
             <w:pPr>
@@ -5313,7 +5313,7 @@
               <w:rPr>
                 <w:rFonts w:ascii="Arial" w:hAnsi="Arial"/>
                 <w:b/>
-                <w:color w:val="FFFFFF"/>
+                <w:color w:val="111111"/>
                 <w:sz w:val="15"/>
               </w:rPr>
               <w:t>5</w:t>
@@ -5322,9 +5322,9 @@
         </w:tc>
         <w:tc>
           <w:tcPr>
-            <w:tcW w:type="dxa" w:w="1563"/>
-            <w:vAlign w:val="center"/>
-            <w:shd w:fill="000000"/>
+            <w:tcW w:type="dxa" w:w="533"/>
+            <w:vAlign w:val="center"/>
+            <w:shd w:fill="D9D9D9"/>
           </w:tcPr>
           <w:p>
             <w:pPr>
@@ -5336,7 +5336,7 @@
               <w:rPr>
                 <w:rFonts w:ascii="Arial" w:hAnsi="Arial"/>
                 <w:b/>
-                <w:color w:val="FFFFFF"/>
+                <w:color w:val="111111"/>
                 <w:sz w:val="15"/>
               </w:rPr>
               <w:t>4</w:t>
@@ -5345,9 +5345,9 @@
         </w:tc>
         <w:tc>
           <w:tcPr>
-            <w:tcW w:type="dxa" w:w="1563"/>
-            <w:vAlign w:val="center"/>
-            <w:shd w:fill="000000"/>
+            <w:tcW w:type="dxa" w:w="533"/>
+            <w:vAlign w:val="center"/>
+            <w:shd w:fill="D9D9D9"/>
           </w:tcPr>
           <w:p>
             <w:pPr>
@@ -5359,7 +5359,7 @@
               <w:rPr>
                 <w:rFonts w:ascii="Arial" w:hAnsi="Arial"/>
                 <w:b/>
-                <w:color w:val="FFFFFF"/>
+                <w:color w:val="111111"/>
                 <w:sz w:val="15"/>
               </w:rPr>
               <w:t>3</w:t>
@@ -5368,9 +5368,9 @@
         </w:tc>
         <w:tc>
           <w:tcPr>
-            <w:tcW w:type="dxa" w:w="1563"/>
-            <w:vAlign w:val="center"/>
-            <w:shd w:fill="000000"/>
+            <w:tcW w:type="dxa" w:w="533"/>
+            <w:vAlign w:val="center"/>
+            <w:shd w:fill="D9D9D9"/>
           </w:tcPr>
           <w:p>
             <w:pPr>
@@ -5382,7 +5382,7 @@
               <w:rPr>
                 <w:rFonts w:ascii="Arial" w:hAnsi="Arial"/>
                 <w:b/>
-                <w:color w:val="FFFFFF"/>
+                <w:color w:val="111111"/>
                 <w:sz w:val="15"/>
               </w:rPr>
               <w:t>2</w:t>
@@ -5391,9 +5391,9 @@
         </w:tc>
         <w:tc>
           <w:tcPr>
-            <w:tcW w:type="dxa" w:w="1563"/>
-            <w:vAlign w:val="center"/>
-            <w:shd w:fill="000000"/>
+            <w:tcW w:type="dxa" w:w="533"/>
+            <w:vAlign w:val="center"/>
+            <w:shd w:fill="D9D9D9"/>
           </w:tcPr>
           <w:p>
             <w:pPr>
@@ -5405,7 +5405,7 @@
               <w:rPr>
                 <w:rFonts w:ascii="Arial" w:hAnsi="Arial"/>
                 <w:b/>
-                <w:color w:val="FFFFFF"/>
+                <w:color w:val="111111"/>
                 <w:sz w:val="15"/>
               </w:rPr>
               <w:t>1</w:t>
@@ -5419,7 +5419,7 @@
         </w:trPr>
         <w:tc>
           <w:tcPr>
-            <w:tcW w:type="dxa" w:w="1563"/>
+            <w:tcW w:type="dxa" w:w="518"/>
             <w:vAlign w:val="center"/>
           </w:tcPr>
           <w:p>
@@ -5441,7 +5441,7 @@
         </w:tc>
         <w:tc>
           <w:tcPr>
-            <w:tcW w:type="dxa" w:w="1563"/>
+            <w:tcW w:type="dxa" w:w="7762"/>
             <w:vAlign w:val="center"/>
           </w:tcPr>
           <w:p>
@@ -5463,7 +5463,7 @@
         </w:tc>
         <w:tc>
           <w:tcPr>
-            <w:tcW w:type="dxa" w:w="1563"/>
+            <w:tcW w:type="dxa" w:w="533"/>
             <w:vAlign w:val="center"/>
           </w:tcPr>
           <w:p>
@@ -5485,7 +5485,7 @@
         </w:tc>
         <w:tc>
           <w:tcPr>
-            <w:tcW w:type="dxa" w:w="1563"/>
+            <w:tcW w:type="dxa" w:w="533"/>
             <w:vAlign w:val="center"/>
           </w:tcPr>
           <w:p>
@@ -5507,7 +5507,7 @@
         </w:tc>
         <w:tc>
           <w:tcPr>
-            <w:tcW w:type="dxa" w:w="1563"/>
+            <w:tcW w:type="dxa" w:w="533"/>
             <w:vAlign w:val="center"/>
           </w:tcPr>
           <w:p>
@@ -5529,7 +5529,7 @@
         </w:tc>
         <w:tc>
           <w:tcPr>
-            <w:tcW w:type="dxa" w:w="1563"/>
+            <w:tcW w:type="dxa" w:w="533"/>
             <w:vAlign w:val="center"/>
           </w:tcPr>
           <w:p>
@@ -5551,7 +5551,7 @@
         </w:tc>
         <w:tc>
           <w:tcPr>
-            <w:tcW w:type="dxa" w:w="1563"/>
+            <w:tcW w:type="dxa" w:w="533"/>
             <w:vAlign w:val="center"/>
           </w:tcPr>
           <w:p>
@@ -5578,8 +5578,8 @@
         </w:trPr>
         <w:tc>
           <w:tcPr>
-            <w:tcW w:type="dxa" w:w="1563"/>
-            <w:shd w:fill="F2F2F2"/>
+            <w:tcW w:type="dxa" w:w="518"/>
+            <w:shd w:fill="F5F5F5"/>
             <w:vAlign w:val="center"/>
           </w:tcPr>
           <w:p>
@@ -5601,8 +5601,8 @@
         </w:tc>
         <w:tc>
           <w:tcPr>
-            <w:tcW w:type="dxa" w:w="1563"/>
-            <w:shd w:fill="F2F2F2"/>
+            <w:tcW w:type="dxa" w:w="7762"/>
+            <w:shd w:fill="F5F5F5"/>
             <w:vAlign w:val="center"/>
           </w:tcPr>
           <w:p>
@@ -5624,8 +5624,8 @@
         </w:tc>
         <w:tc>
           <w:tcPr>
-            <w:tcW w:type="dxa" w:w="1563"/>
-            <w:shd w:fill="F2F2F2"/>
+            <w:tcW w:type="dxa" w:w="533"/>
+            <w:shd w:fill="F5F5F5"/>
             <w:vAlign w:val="center"/>
           </w:tcPr>
           <w:p>
@@ -5647,8 +5647,8 @@
         </w:tc>
         <w:tc>
           <w:tcPr>
-            <w:tcW w:type="dxa" w:w="1563"/>
-            <w:shd w:fill="F2F2F2"/>
+            <w:tcW w:type="dxa" w:w="533"/>
+            <w:shd w:fill="F5F5F5"/>
             <w:vAlign w:val="center"/>
           </w:tcPr>
           <w:p>
@@ -5670,8 +5670,8 @@
         </w:tc>
         <w:tc>
           <w:tcPr>
-            <w:tcW w:type="dxa" w:w="1563"/>
-            <w:shd w:fill="F2F2F2"/>
+            <w:tcW w:type="dxa" w:w="533"/>
+            <w:shd w:fill="F5F5F5"/>
             <w:vAlign w:val="center"/>
           </w:tcPr>
           <w:p>
@@ -5693,8 +5693,8 @@
         </w:tc>
         <w:tc>
           <w:tcPr>
-            <w:tcW w:type="dxa" w:w="1563"/>
-            <w:shd w:fill="F2F2F2"/>
+            <w:tcW w:type="dxa" w:w="533"/>
+            <w:shd w:fill="F5F5F5"/>
             <w:vAlign w:val="center"/>
           </w:tcPr>
           <w:p>
@@ -5716,8 +5716,8 @@
         </w:tc>
         <w:tc>
           <w:tcPr>
-            <w:tcW w:type="dxa" w:w="1563"/>
-            <w:shd w:fill="F2F2F2"/>
+            <w:tcW w:type="dxa" w:w="533"/>
+            <w:shd w:fill="F5F5F5"/>
             <w:vAlign w:val="center"/>
           </w:tcPr>
           <w:p>
@@ -5744,7 +5744,7 @@
         </w:trPr>
         <w:tc>
           <w:tcPr>
-            <w:tcW w:type="dxa" w:w="1563"/>
+            <w:tcW w:type="dxa" w:w="518"/>
             <w:vAlign w:val="center"/>
           </w:tcPr>
           <w:p>
@@ -5766,7 +5766,7 @@
         </w:tc>
         <w:tc>
           <w:tcPr>
-            <w:tcW w:type="dxa" w:w="1563"/>
+            <w:tcW w:type="dxa" w:w="7762"/>
             <w:vAlign w:val="center"/>
           </w:tcPr>
           <w:p>
@@ -5788,7 +5788,7 @@
         </w:tc>
         <w:tc>
           <w:tcPr>
-            <w:tcW w:type="dxa" w:w="1563"/>
+            <w:tcW w:type="dxa" w:w="533"/>
             <w:vAlign w:val="center"/>
           </w:tcPr>
           <w:p>
@@ -5810,7 +5810,7 @@
         </w:tc>
         <w:tc>
           <w:tcPr>
-            <w:tcW w:type="dxa" w:w="1563"/>
+            <w:tcW w:type="dxa" w:w="533"/>
             <w:vAlign w:val="center"/>
           </w:tcPr>
           <w:p>
@@ -5832,7 +5832,7 @@
         </w:tc>
         <w:tc>
           <w:tcPr>
-            <w:tcW w:type="dxa" w:w="1563"/>
+            <w:tcW w:type="dxa" w:w="533"/>
             <w:vAlign w:val="center"/>
           </w:tcPr>
           <w:p>
@@ -5854,7 +5854,7 @@
         </w:tc>
         <w:tc>
           <w:tcPr>
-            <w:tcW w:type="dxa" w:w="1563"/>
+            <w:tcW w:type="dxa" w:w="533"/>
             <w:vAlign w:val="center"/>
           </w:tcPr>
           <w:p>
@@ -5876,7 +5876,7 @@
         </w:tc>
         <w:tc>
           <w:tcPr>
-            <w:tcW w:type="dxa" w:w="1563"/>
+            <w:tcW w:type="dxa" w:w="533"/>
             <w:vAlign w:val="center"/>
           </w:tcPr>
           <w:p>
@@ -5903,8 +5903,8 @@
         </w:trPr>
         <w:tc>
           <w:tcPr>
-            <w:tcW w:type="dxa" w:w="1563"/>
-            <w:shd w:fill="F2F2F2"/>
+            <w:tcW w:type="dxa" w:w="518"/>
+            <w:shd w:fill="F5F5F5"/>
             <w:vAlign w:val="center"/>
           </w:tcPr>
           <w:p>
@@ -5926,8 +5926,8 @@
         </w:tc>
         <w:tc>
           <w:tcPr>
-            <w:tcW w:type="dxa" w:w="1563"/>
-            <w:shd w:fill="F2F2F2"/>
+            <w:tcW w:type="dxa" w:w="7762"/>
+            <w:shd w:fill="F5F5F5"/>
             <w:vAlign w:val="center"/>
           </w:tcPr>
           <w:p>
@@ -5949,8 +5949,8 @@
         </w:tc>
         <w:tc>
           <w:tcPr>
-            <w:tcW w:type="dxa" w:w="1563"/>
-            <w:shd w:fill="F2F2F2"/>
+            <w:tcW w:type="dxa" w:w="533"/>
+            <w:shd w:fill="F5F5F5"/>
             <w:vAlign w:val="center"/>
           </w:tcPr>
           <w:p>
@@ -5972,8 +5972,8 @@
         </w:tc>
         <w:tc>
           <w:tcPr>
-            <w:tcW w:type="dxa" w:w="1563"/>
-            <w:shd w:fill="F2F2F2"/>
+            <w:tcW w:type="dxa" w:w="533"/>
+            <w:shd w:fill="F5F5F5"/>
             <w:vAlign w:val="center"/>
           </w:tcPr>
           <w:p>
@@ -5995,8 +5995,8 @@
         </w:tc>
         <w:tc>
           <w:tcPr>
-            <w:tcW w:type="dxa" w:w="1563"/>
-            <w:shd w:fill="F2F2F2"/>
+            <w:tcW w:type="dxa" w:w="533"/>
+            <w:shd w:fill="F5F5F5"/>
             <w:vAlign w:val="center"/>
           </w:tcPr>
           <w:p>
@@ -6018,8 +6018,8 @@
         </w:tc>
         <w:tc>
           <w:tcPr>
-            <w:tcW w:type="dxa" w:w="1563"/>
-            <w:shd w:fill="F2F2F2"/>
+            <w:tcW w:type="dxa" w:w="533"/>
+            <w:shd w:fill="F5F5F5"/>
             <w:vAlign w:val="center"/>
           </w:tcPr>
           <w:p>
@@ -6041,8 +6041,8 @@
         </w:tc>
         <w:tc>
           <w:tcPr>
-            <w:tcW w:type="dxa" w:w="1563"/>
-            <w:shd w:fill="F2F2F2"/>
+            <w:tcW w:type="dxa" w:w="533"/>
+            <w:shd w:fill="F5F5F5"/>
             <w:vAlign w:val="center"/>
           </w:tcPr>
           <w:p>
@@ -6069,7 +6069,7 @@
         </w:trPr>
         <w:tc>
           <w:tcPr>
-            <w:tcW w:type="dxa" w:w="1563"/>
+            <w:tcW w:type="dxa" w:w="518"/>
             <w:vAlign w:val="center"/>
           </w:tcPr>
           <w:p>
@@ -6091,7 +6091,7 @@
         </w:tc>
         <w:tc>
           <w:tcPr>
-            <w:tcW w:type="dxa" w:w="1563"/>
+            <w:tcW w:type="dxa" w:w="7762"/>
             <w:vAlign w:val="center"/>
           </w:tcPr>
           <w:p>
@@ -6113,7 +6113,7 @@
         </w:tc>
         <w:tc>
           <w:tcPr>
-            <w:tcW w:type="dxa" w:w="1563"/>
+            <w:tcW w:type="dxa" w:w="533"/>
             <w:vAlign w:val="center"/>
           </w:tcPr>
           <w:p>
@@ -6135,7 +6135,7 @@
         </w:tc>
         <w:tc>
           <w:tcPr>
-            <w:tcW w:type="dxa" w:w="1563"/>
+            <w:tcW w:type="dxa" w:w="533"/>
             <w:vAlign w:val="center"/>
           </w:tcPr>
           <w:p>
@@ -6157,7 +6157,7 @@
         </w:tc>
         <w:tc>
           <w:tcPr>
-            <w:tcW w:type="dxa" w:w="1563"/>
+            <w:tcW w:type="dxa" w:w="533"/>
             <w:vAlign w:val="center"/>
           </w:tcPr>
           <w:p>
@@ -6179,7 +6179,7 @@
         </w:tc>
         <w:tc>
           <w:tcPr>
-            <w:tcW w:type="dxa" w:w="1563"/>
+            <w:tcW w:type="dxa" w:w="533"/>
             <w:vAlign w:val="center"/>
           </w:tcPr>
           <w:p>
@@ -6201,7 +6201,7 @@
         </w:tc>
         <w:tc>
           <w:tcPr>
-            <w:tcW w:type="dxa" w:w="1563"/>
+            <w:tcW w:type="dxa" w:w="533"/>
             <w:vAlign w:val="center"/>
           </w:tcPr>
           <w:p>
@@ -6228,8 +6228,8 @@
         </w:trPr>
         <w:tc>
           <w:tcPr>
-            <w:tcW w:type="dxa" w:w="1563"/>
-            <w:shd w:fill="F2F2F2"/>
+            <w:tcW w:type="dxa" w:w="518"/>
+            <w:shd w:fill="F5F5F5"/>
             <w:vAlign w:val="center"/>
           </w:tcPr>
           <w:p>
@@ -6251,8 +6251,8 @@
         </w:tc>
         <w:tc>
           <w:tcPr>
-            <w:tcW w:type="dxa" w:w="1563"/>
-            <w:shd w:fill="F2F2F2"/>
+            <w:tcW w:type="dxa" w:w="7762"/>
+            <w:shd w:fill="F5F5F5"/>
             <w:vAlign w:val="center"/>
           </w:tcPr>
           <w:p>
@@ -6274,8 +6274,8 @@
         </w:tc>
         <w:tc>
           <w:tcPr>
-            <w:tcW w:type="dxa" w:w="1563"/>
-            <w:shd w:fill="F2F2F2"/>
+            <w:tcW w:type="dxa" w:w="533"/>
+            <w:shd w:fill="F5F5F5"/>
             <w:vAlign w:val="center"/>
           </w:tcPr>
           <w:p>
@@ -6297,8 +6297,8 @@
         </w:tc>
         <w:tc>
           <w:tcPr>
-            <w:tcW w:type="dxa" w:w="1563"/>
-            <w:shd w:fill="F2F2F2"/>
+            <w:tcW w:type="dxa" w:w="533"/>
+            <w:shd w:fill="F5F5F5"/>
             <w:vAlign w:val="center"/>
           </w:tcPr>
           <w:p>
@@ -6320,8 +6320,8 @@
         </w:tc>
         <w:tc>
           <w:tcPr>
-            <w:tcW w:type="dxa" w:w="1563"/>
-            <w:shd w:fill="F2F2F2"/>
+            <w:tcW w:type="dxa" w:w="533"/>
+            <w:shd w:fill="F5F5F5"/>
             <w:vAlign w:val="center"/>
           </w:tcPr>
           <w:p>
@@ -6343,8 +6343,8 @@
         </w:tc>
         <w:tc>
           <w:tcPr>
-            <w:tcW w:type="dxa" w:w="1563"/>
-            <w:shd w:fill="F2F2F2"/>
+            <w:tcW w:type="dxa" w:w="533"/>
+            <w:shd w:fill="F5F5F5"/>
             <w:vAlign w:val="center"/>
           </w:tcPr>
           <w:p>
@@ -6366,8 +6366,8 @@
         </w:tc>
         <w:tc>
           <w:tcPr>
-            <w:tcW w:type="dxa" w:w="1563"/>
-            <w:shd w:fill="F2F2F2"/>
+            <w:tcW w:type="dxa" w:w="533"/>
+            <w:shd w:fill="F5F5F5"/>
             <w:vAlign w:val="center"/>
           </w:tcPr>
           <w:p>
@@ -6394,7 +6394,7 @@
         </w:trPr>
         <w:tc>
           <w:tcPr>
-            <w:tcW w:type="dxa" w:w="1563"/>
+            <w:tcW w:type="dxa" w:w="518"/>
             <w:vAlign w:val="center"/>
           </w:tcPr>
           <w:p>
@@ -6416,7 +6416,7 @@
         </w:tc>
         <w:tc>
           <w:tcPr>
-            <w:tcW w:type="dxa" w:w="1563"/>
+            <w:tcW w:type="dxa" w:w="7762"/>
             <w:vAlign w:val="center"/>
           </w:tcPr>
           <w:p>
@@ -6438,7 +6438,7 @@
         </w:tc>
         <w:tc>
           <w:tcPr>
-            <w:tcW w:type="dxa" w:w="1563"/>
+            <w:tcW w:type="dxa" w:w="533"/>
             <w:vAlign w:val="center"/>
           </w:tcPr>
           <w:p>
@@ -6460,7 +6460,7 @@
         </w:tc>
         <w:tc>
           <w:tcPr>
-            <w:tcW w:type="dxa" w:w="1563"/>
+            <w:tcW w:type="dxa" w:w="533"/>
             <w:vAlign w:val="center"/>
           </w:tcPr>
           <w:p>
@@ -6482,7 +6482,7 @@
         </w:tc>
         <w:tc>
           <w:tcPr>
-            <w:tcW w:type="dxa" w:w="1563"/>
+            <w:tcW w:type="dxa" w:w="533"/>
             <w:vAlign w:val="center"/>
           </w:tcPr>
           <w:p>
@@ -6504,7 +6504,7 @@
         </w:tc>
         <w:tc>
           <w:tcPr>
-            <w:tcW w:type="dxa" w:w="1563"/>
+            <w:tcW w:type="dxa" w:w="533"/>
             <w:vAlign w:val="center"/>
           </w:tcPr>
           <w:p>
@@ -6526,7 +6526,7 @@
         </w:tc>
         <w:tc>
           <w:tcPr>
-            <w:tcW w:type="dxa" w:w="1563"/>
+            <w:tcW w:type="dxa" w:w="533"/>
             <w:vAlign w:val="center"/>
           </w:tcPr>
           <w:p>
@@ -6553,8 +6553,8 @@
         </w:trPr>
         <w:tc>
           <w:tcPr>
-            <w:tcW w:type="dxa" w:w="1563"/>
-            <w:shd w:fill="F2F2F2"/>
+            <w:tcW w:type="dxa" w:w="518"/>
+            <w:shd w:fill="F5F5F5"/>
             <w:vAlign w:val="center"/>
           </w:tcPr>
           <w:p>
@@ -6576,8 +6576,8 @@
         </w:tc>
         <w:tc>
           <w:tcPr>
-            <w:tcW w:type="dxa" w:w="1563"/>
-            <w:shd w:fill="F2F2F2"/>
+            <w:tcW w:type="dxa" w:w="7762"/>
+            <w:shd w:fill="F5F5F5"/>
             <w:vAlign w:val="center"/>
           </w:tcPr>
           <w:p>
@@ -6599,8 +6599,8 @@
         </w:tc>
         <w:tc>
           <w:tcPr>
-            <w:tcW w:type="dxa" w:w="1563"/>
-            <w:shd w:fill="F2F2F2"/>
+            <w:tcW w:type="dxa" w:w="533"/>
+            <w:shd w:fill="F5F5F5"/>
             <w:vAlign w:val="center"/>
           </w:tcPr>
           <w:p>
@@ -6622,8 +6622,8 @@
         </w:tc>
         <w:tc>
           <w:tcPr>
-            <w:tcW w:type="dxa" w:w="1563"/>
-            <w:shd w:fill="F2F2F2"/>
+            <w:tcW w:type="dxa" w:w="533"/>
+            <w:shd w:fill="F5F5F5"/>
             <w:vAlign w:val="center"/>
           </w:tcPr>
           <w:p>
@@ -6645,8 +6645,8 @@
         </w:tc>
         <w:tc>
           <w:tcPr>
-            <w:tcW w:type="dxa" w:w="1563"/>
-            <w:shd w:fill="F2F2F2"/>
+            <w:tcW w:type="dxa" w:w="533"/>
+            <w:shd w:fill="F5F5F5"/>
             <w:vAlign w:val="center"/>
           </w:tcPr>
           <w:p>
@@ -6668,8 +6668,8 @@
         </w:tc>
         <w:tc>
           <w:tcPr>
-            <w:tcW w:type="dxa" w:w="1563"/>
-            <w:shd w:fill="F2F2F2"/>
+            <w:tcW w:type="dxa" w:w="533"/>
+            <w:shd w:fill="F5F5F5"/>
             <w:vAlign w:val="center"/>
           </w:tcPr>
           <w:p>
@@ -6691,8 +6691,8 @@
         </w:tc>
         <w:tc>
           <w:tcPr>
-            <w:tcW w:type="dxa" w:w="1563"/>
-            <w:shd w:fill="F2F2F2"/>
+            <w:tcW w:type="dxa" w:w="533"/>
+            <w:shd w:fill="F5F5F5"/>
             <w:vAlign w:val="center"/>
           </w:tcPr>
           <w:p>
@@ -6768,10 +6768,10 @@
         </w:trPr>
         <w:tc>
           <w:tcPr>
-            <w:tcW w:type="dxa" w:w="1563"/>
+            <w:tcW w:type="dxa" w:w="518"/>
             <w:vMerge w:val="restart"/>
             <w:vAlign w:val="center"/>
-            <w:shd w:fill="000000"/>
+            <w:shd w:fill="D9D9D9"/>
           </w:tcPr>
           <w:p>
             <w:pPr>
@@ -6783,7 +6783,7 @@
               <w:rPr>
                 <w:rFonts w:ascii="Arial" w:hAnsi="Arial"/>
                 <w:b/>
-                <w:color w:val="FFFFFF"/>
+                <w:color w:val="111111"/>
                 <w:sz w:val="15"/>
               </w:rPr>
               <w:t>NO.</w:t>
@@ -6792,10 +6792,10 @@
         </w:tc>
         <w:tc>
           <w:tcPr>
-            <w:tcW w:type="dxa" w:w="1563"/>
+            <w:tcW w:type="dxa" w:w="7762"/>
             <w:vMerge w:val="restart"/>
             <w:vAlign w:val="center"/>
-            <w:shd w:fill="000000"/>
+            <w:shd w:fill="D9D9D9"/>
           </w:tcPr>
           <w:p>
             <w:pPr>
@@ -6807,7 +6807,7 @@
               <w:rPr>
                 <w:rFonts w:ascii="Arial" w:hAnsi="Arial"/>
                 <w:b/>
-                <w:color w:val="FFFFFF"/>
+                <w:color w:val="111111"/>
                 <w:sz w:val="15"/>
               </w:rPr>
               <w:t>STATEMENTS</w:t>
@@ -6816,10 +6816,10 @@
         </w:tc>
         <w:tc>
           <w:tcPr>
-            <w:tcW w:type="dxa" w:w="7815"/>
+            <w:tcW w:type="dxa" w:w="2664"/>
             <w:gridSpan w:val="5"/>
             <w:vAlign w:val="center"/>
-            <w:shd w:fill="000000"/>
+            <w:shd w:fill="D9D9D9"/>
           </w:tcPr>
           <w:p>
             <w:pPr>
@@ -6831,7 +6831,7 @@
               <w:rPr>
                 <w:rFonts w:ascii="Arial" w:hAnsi="Arial"/>
                 <w:b/>
-                <w:color w:val="FFFFFF"/>
+                <w:color w:val="111111"/>
                 <w:sz w:val="15"/>
               </w:rPr>
               <w:t>LEVEL OF AGREEMENT</w:t>
@@ -6860,9 +6860,9 @@
         </w:tc>
         <w:tc>
           <w:tcPr>
-            <w:tcW w:type="dxa" w:w="1563"/>
-            <w:vAlign w:val="center"/>
-            <w:shd w:fill="000000"/>
+            <w:tcW w:type="dxa" w:w="533"/>
+            <w:vAlign w:val="center"/>
+            <w:shd w:fill="D9D9D9"/>
           </w:tcPr>
           <w:p>
             <w:pPr>
@@ -6874,7 +6874,7 @@
               <w:rPr>
                 <w:rFonts w:ascii="Arial" w:hAnsi="Arial"/>
                 <w:b/>
-                <w:color w:val="FFFFFF"/>
+                <w:color w:val="111111"/>
                 <w:sz w:val="15"/>
               </w:rPr>
               <w:t>5</w:t>
@@ -6883,9 +6883,9 @@
         </w:tc>
         <w:tc>
           <w:tcPr>
-            <w:tcW w:type="dxa" w:w="1563"/>
-            <w:vAlign w:val="center"/>
-            <w:shd w:fill="000000"/>
+            <w:tcW w:type="dxa" w:w="533"/>
+            <w:vAlign w:val="center"/>
+            <w:shd w:fill="D9D9D9"/>
           </w:tcPr>
           <w:p>
             <w:pPr>
@@ -6897,7 +6897,7 @@
               <w:rPr>
                 <w:rFonts w:ascii="Arial" w:hAnsi="Arial"/>
                 <w:b/>
-                <w:color w:val="FFFFFF"/>
+                <w:color w:val="111111"/>
                 <w:sz w:val="15"/>
               </w:rPr>
               <w:t>4</w:t>
@@ -6906,9 +6906,9 @@
         </w:tc>
         <w:tc>
           <w:tcPr>
-            <w:tcW w:type="dxa" w:w="1563"/>
-            <w:vAlign w:val="center"/>
-            <w:shd w:fill="000000"/>
+            <w:tcW w:type="dxa" w:w="533"/>
+            <w:vAlign w:val="center"/>
+            <w:shd w:fill="D9D9D9"/>
           </w:tcPr>
           <w:p>
             <w:pPr>
@@ -6920,7 +6920,7 @@
               <w:rPr>
                 <w:rFonts w:ascii="Arial" w:hAnsi="Arial"/>
                 <w:b/>
-                <w:color w:val="FFFFFF"/>
+                <w:color w:val="111111"/>
                 <w:sz w:val="15"/>
               </w:rPr>
               <w:t>3</w:t>
@@ -6929,9 +6929,9 @@
         </w:tc>
         <w:tc>
           <w:tcPr>
-            <w:tcW w:type="dxa" w:w="1563"/>
-            <w:vAlign w:val="center"/>
-            <w:shd w:fill="000000"/>
+            <w:tcW w:type="dxa" w:w="533"/>
+            <w:vAlign w:val="center"/>
+            <w:shd w:fill="D9D9D9"/>
           </w:tcPr>
           <w:p>
             <w:pPr>
@@ -6943,7 +6943,7 @@
               <w:rPr>
                 <w:rFonts w:ascii="Arial" w:hAnsi="Arial"/>
                 <w:b/>
-                <w:color w:val="FFFFFF"/>
+                <w:color w:val="111111"/>
                 <w:sz w:val="15"/>
               </w:rPr>
               <w:t>2</w:t>
@@ -6952,9 +6952,9 @@
         </w:tc>
         <w:tc>
           <w:tcPr>
-            <w:tcW w:type="dxa" w:w="1563"/>
-            <w:vAlign w:val="center"/>
-            <w:shd w:fill="000000"/>
+            <w:tcW w:type="dxa" w:w="533"/>
+            <w:vAlign w:val="center"/>
+            <w:shd w:fill="D9D9D9"/>
           </w:tcPr>
           <w:p>
             <w:pPr>
@@ -6966,7 +6966,7 @@
               <w:rPr>
                 <w:rFonts w:ascii="Arial" w:hAnsi="Arial"/>
                 <w:b/>
-                <w:color w:val="FFFFFF"/>
+                <w:color w:val="111111"/>
                 <w:sz w:val="15"/>
               </w:rPr>
               <w:t>1</w:t>
@@ -6980,7 +6980,7 @@
         </w:trPr>
         <w:tc>
           <w:tcPr>
-            <w:tcW w:type="dxa" w:w="1563"/>
+            <w:tcW w:type="dxa" w:w="518"/>
             <w:vAlign w:val="center"/>
           </w:tcPr>
           <w:p>
@@ -7002,7 +7002,7 @@
         </w:tc>
         <w:tc>
           <w:tcPr>
-            <w:tcW w:type="dxa" w:w="1563"/>
+            <w:tcW w:type="dxa" w:w="7762"/>
             <w:vAlign w:val="center"/>
           </w:tcPr>
           <w:p>
@@ -7024,7 +7024,7 @@
         </w:tc>
         <w:tc>
           <w:tcPr>
-            <w:tcW w:type="dxa" w:w="1563"/>
+            <w:tcW w:type="dxa" w:w="533"/>
             <w:vAlign w:val="center"/>
           </w:tcPr>
           <w:p>
@@ -7046,7 +7046,7 @@
         </w:tc>
         <w:tc>
           <w:tcPr>
-            <w:tcW w:type="dxa" w:w="1563"/>
+            <w:tcW w:type="dxa" w:w="533"/>
             <w:vAlign w:val="center"/>
           </w:tcPr>
           <w:p>
@@ -7068,7 +7068,7 @@
         </w:tc>
         <w:tc>
           <w:tcPr>
-            <w:tcW w:type="dxa" w:w="1563"/>
+            <w:tcW w:type="dxa" w:w="533"/>
             <w:vAlign w:val="center"/>
           </w:tcPr>
           <w:p>
@@ -7090,7 +7090,7 @@
         </w:tc>
         <w:tc>
           <w:tcPr>
-            <w:tcW w:type="dxa" w:w="1563"/>
+            <w:tcW w:type="dxa" w:w="533"/>
             <w:vAlign w:val="center"/>
           </w:tcPr>
           <w:p>
@@ -7112,7 +7112,7 @@
         </w:tc>
         <w:tc>
           <w:tcPr>
-            <w:tcW w:type="dxa" w:w="1563"/>
+            <w:tcW w:type="dxa" w:w="533"/>
             <w:vAlign w:val="center"/>
           </w:tcPr>
           <w:p>
@@ -7139,8 +7139,8 @@
         </w:trPr>
         <w:tc>
           <w:tcPr>
-            <w:tcW w:type="dxa" w:w="1563"/>
-            <w:shd w:fill="F2F2F2"/>
+            <w:tcW w:type="dxa" w:w="518"/>
+            <w:shd w:fill="F5F5F5"/>
             <w:vAlign w:val="center"/>
           </w:tcPr>
           <w:p>
@@ -7162,8 +7162,8 @@
         </w:tc>
         <w:tc>
           <w:tcPr>
-            <w:tcW w:type="dxa" w:w="1563"/>
-            <w:shd w:fill="F2F2F2"/>
+            <w:tcW w:type="dxa" w:w="7762"/>
+            <w:shd w:fill="F5F5F5"/>
             <w:vAlign w:val="center"/>
           </w:tcPr>
           <w:p>
@@ -7185,8 +7185,8 @@
         </w:tc>
         <w:tc>
           <w:tcPr>
-            <w:tcW w:type="dxa" w:w="1563"/>
-            <w:shd w:fill="F2F2F2"/>
+            <w:tcW w:type="dxa" w:w="533"/>
+            <w:shd w:fill="F5F5F5"/>
             <w:vAlign w:val="center"/>
           </w:tcPr>
           <w:p>
@@ -7208,8 +7208,8 @@
         </w:tc>
         <w:tc>
           <w:tcPr>
-            <w:tcW w:type="dxa" w:w="1563"/>
-            <w:shd w:fill="F2F2F2"/>
+            <w:tcW w:type="dxa" w:w="533"/>
+            <w:shd w:fill="F5F5F5"/>
             <w:vAlign w:val="center"/>
           </w:tcPr>
           <w:p>
@@ -7231,8 +7231,8 @@
         </w:tc>
         <w:tc>
           <w:tcPr>
-            <w:tcW w:type="dxa" w:w="1563"/>
-            <w:shd w:fill="F2F2F2"/>
+            <w:tcW w:type="dxa" w:w="533"/>
+            <w:shd w:fill="F5F5F5"/>
             <w:vAlign w:val="center"/>
           </w:tcPr>
           <w:p>
@@ -7254,8 +7254,8 @@
         </w:tc>
         <w:tc>
           <w:tcPr>
-            <w:tcW w:type="dxa" w:w="1563"/>
-            <w:shd w:fill="F2F2F2"/>
+            <w:tcW w:type="dxa" w:w="533"/>
+            <w:shd w:fill="F5F5F5"/>
             <w:vAlign w:val="center"/>
           </w:tcPr>
           <w:p>
@@ -7277,8 +7277,8 @@
         </w:tc>
         <w:tc>
           <w:tcPr>
-            <w:tcW w:type="dxa" w:w="1563"/>
-            <w:shd w:fill="F2F2F2"/>
+            <w:tcW w:type="dxa" w:w="533"/>
+            <w:shd w:fill="F5F5F5"/>
             <w:vAlign w:val="center"/>
           </w:tcPr>
           <w:p>
@@ -7305,7 +7305,7 @@
         </w:trPr>
         <w:tc>
           <w:tcPr>
-            <w:tcW w:type="dxa" w:w="1563"/>
+            <w:tcW w:type="dxa" w:w="518"/>
             <w:vAlign w:val="center"/>
           </w:tcPr>
           <w:p>
@@ -7327,7 +7327,7 @@
         </w:tc>
         <w:tc>
           <w:tcPr>
-            <w:tcW w:type="dxa" w:w="1563"/>
+            <w:tcW w:type="dxa" w:w="7762"/>
             <w:vAlign w:val="center"/>
           </w:tcPr>
           <w:p>
@@ -7349,7 +7349,7 @@
         </w:tc>
         <w:tc>
           <w:tcPr>
-            <w:tcW w:type="dxa" w:w="1563"/>
+            <w:tcW w:type="dxa" w:w="533"/>
             <w:vAlign w:val="center"/>
           </w:tcPr>
           <w:p>
@@ -7371,7 +7371,7 @@
         </w:tc>
         <w:tc>
           <w:tcPr>
-            <w:tcW w:type="dxa" w:w="1563"/>
+            <w:tcW w:type="dxa" w:w="533"/>
             <w:vAlign w:val="center"/>
           </w:tcPr>
           <w:p>
@@ -7393,7 +7393,7 @@
         </w:tc>
         <w:tc>
           <w:tcPr>
-            <w:tcW w:type="dxa" w:w="1563"/>
+            <w:tcW w:type="dxa" w:w="533"/>
             <w:vAlign w:val="center"/>
           </w:tcPr>
           <w:p>
@@ -7415,7 +7415,7 @@
         </w:tc>
         <w:tc>
           <w:tcPr>
-            <w:tcW w:type="dxa" w:w="1563"/>
+            <w:tcW w:type="dxa" w:w="533"/>
             <w:vAlign w:val="center"/>
           </w:tcPr>
           <w:p>
@@ -7437,7 +7437,7 @@
         </w:tc>
         <w:tc>
           <w:tcPr>
-            <w:tcW w:type="dxa" w:w="1563"/>
+            <w:tcW w:type="dxa" w:w="533"/>
             <w:vAlign w:val="center"/>
           </w:tcPr>
           <w:p>
@@ -7464,8 +7464,8 @@
         </w:trPr>
         <w:tc>
           <w:tcPr>
-            <w:tcW w:type="dxa" w:w="1563"/>
-            <w:shd w:fill="F2F2F2"/>
+            <w:tcW w:type="dxa" w:w="518"/>
+            <w:shd w:fill="F5F5F5"/>
             <w:vAlign w:val="center"/>
           </w:tcPr>
           <w:p>
@@ -7487,8 +7487,8 @@
         </w:tc>
         <w:tc>
           <w:tcPr>
-            <w:tcW w:type="dxa" w:w="1563"/>
-            <w:shd w:fill="F2F2F2"/>
+            <w:tcW w:type="dxa" w:w="7762"/>
+            <w:shd w:fill="F5F5F5"/>
             <w:vAlign w:val="center"/>
           </w:tcPr>
           <w:p>
@@ -7510,8 +7510,8 @@
         </w:tc>
         <w:tc>
           <w:tcPr>
-            <w:tcW w:type="dxa" w:w="1563"/>
-            <w:shd w:fill="F2F2F2"/>
+            <w:tcW w:type="dxa" w:w="533"/>
+            <w:shd w:fill="F5F5F5"/>
             <w:vAlign w:val="center"/>
           </w:tcPr>
           <w:p>
@@ -7533,8 +7533,8 @@
         </w:tc>
         <w:tc>
           <w:tcPr>
-            <w:tcW w:type="dxa" w:w="1563"/>
-            <w:shd w:fill="F2F2F2"/>
+            <w:tcW w:type="dxa" w:w="533"/>
+            <w:shd w:fill="F5F5F5"/>
             <w:vAlign w:val="center"/>
           </w:tcPr>
           <w:p>
@@ -7556,8 +7556,8 @@
         </w:tc>
         <w:tc>
           <w:tcPr>
-            <w:tcW w:type="dxa" w:w="1563"/>
-            <w:shd w:fill="F2F2F2"/>
+            <w:tcW w:type="dxa" w:w="533"/>
+            <w:shd w:fill="F5F5F5"/>
             <w:vAlign w:val="center"/>
           </w:tcPr>
           <w:p>
@@ -7579,8 +7579,8 @@
         </w:tc>
         <w:tc>
           <w:tcPr>
-            <w:tcW w:type="dxa" w:w="1563"/>
-            <w:shd w:fill="F2F2F2"/>
+            <w:tcW w:type="dxa" w:w="533"/>
+            <w:shd w:fill="F5F5F5"/>
             <w:vAlign w:val="center"/>
           </w:tcPr>
           <w:p>
@@ -7602,8 +7602,8 @@
         </w:tc>
         <w:tc>
           <w:tcPr>
-            <w:tcW w:type="dxa" w:w="1563"/>
-            <w:shd w:fill="F2F2F2"/>
+            <w:tcW w:type="dxa" w:w="533"/>
+            <w:shd w:fill="F5F5F5"/>
             <w:vAlign w:val="center"/>
           </w:tcPr>
           <w:p>
@@ -7630,7 +7630,7 @@
         </w:trPr>
         <w:tc>
           <w:tcPr>
-            <w:tcW w:type="dxa" w:w="1563"/>
+            <w:tcW w:type="dxa" w:w="518"/>
             <w:vAlign w:val="center"/>
           </w:tcPr>
           <w:p>
@@ -7652,7 +7652,7 @@
         </w:tc>
         <w:tc>
           <w:tcPr>
-            <w:tcW w:type="dxa" w:w="1563"/>
+            <w:tcW w:type="dxa" w:w="7762"/>
             <w:vAlign w:val="center"/>
           </w:tcPr>
           <w:p>
@@ -7674,7 +7674,7 @@
         </w:tc>
         <w:tc>
           <w:tcPr>
-            <w:tcW w:type="dxa" w:w="1563"/>
+            <w:tcW w:type="dxa" w:w="533"/>
             <w:vAlign w:val="center"/>
           </w:tcPr>
           <w:p>
@@ -7696,7 +7696,7 @@
         </w:tc>
         <w:tc>
           <w:tcPr>
-            <w:tcW w:type="dxa" w:w="1563"/>
+            <w:tcW w:type="dxa" w:w="533"/>
             <w:vAlign w:val="center"/>
           </w:tcPr>
           <w:p>
@@ -7718,7 +7718,7 @@
         </w:tc>
         <w:tc>
           <w:tcPr>
-            <w:tcW w:type="dxa" w:w="1563"/>
+            <w:tcW w:type="dxa" w:w="533"/>
             <w:vAlign w:val="center"/>
           </w:tcPr>
           <w:p>
@@ -7740,7 +7740,7 @@
         </w:tc>
         <w:tc>
           <w:tcPr>
-            <w:tcW w:type="dxa" w:w="1563"/>
+            <w:tcW w:type="dxa" w:w="533"/>
             <w:vAlign w:val="center"/>
           </w:tcPr>
           <w:p>
@@ -7762,7 +7762,7 @@
         </w:tc>
         <w:tc>
           <w:tcPr>
-            <w:tcW w:type="dxa" w:w="1563"/>
+            <w:tcW w:type="dxa" w:w="533"/>
             <w:vAlign w:val="center"/>
           </w:tcPr>
           <w:p>
@@ -7789,8 +7789,8 @@
         </w:trPr>
         <w:tc>
           <w:tcPr>
-            <w:tcW w:type="dxa" w:w="1563"/>
-            <w:shd w:fill="F2F2F2"/>
+            <w:tcW w:type="dxa" w:w="518"/>
+            <w:shd w:fill="F5F5F5"/>
             <w:vAlign w:val="center"/>
           </w:tcPr>
           <w:p>
@@ -7812,8 +7812,8 @@
         </w:tc>
         <w:tc>
           <w:tcPr>
-            <w:tcW w:type="dxa" w:w="1563"/>
-            <w:shd w:fill="F2F2F2"/>
+            <w:tcW w:type="dxa" w:w="7762"/>
+            <w:shd w:fill="F5F5F5"/>
             <w:vAlign w:val="center"/>
           </w:tcPr>
           <w:p>
@@ -7835,8 +7835,8 @@
         </w:tc>
         <w:tc>
           <w:tcPr>
-            <w:tcW w:type="dxa" w:w="1563"/>
-            <w:shd w:fill="F2F2F2"/>
+            <w:tcW w:type="dxa" w:w="533"/>
+            <w:shd w:fill="F5F5F5"/>
             <w:vAlign w:val="center"/>
           </w:tcPr>
           <w:p>
@@ -7858,8 +7858,8 @@
         </w:tc>
         <w:tc>
           <w:tcPr>
-            <w:tcW w:type="dxa" w:w="1563"/>
-            <w:shd w:fill="F2F2F2"/>
+            <w:tcW w:type="dxa" w:w="533"/>
+            <w:shd w:fill="F5F5F5"/>
             <w:vAlign w:val="center"/>
           </w:tcPr>
           <w:p>
@@ -7881,8 +7881,8 @@
         </w:tc>
         <w:tc>
           <w:tcPr>
-            <w:tcW w:type="dxa" w:w="1563"/>
-            <w:shd w:fill="F2F2F2"/>
+            <w:tcW w:type="dxa" w:w="533"/>
+            <w:shd w:fill="F5F5F5"/>
             <w:vAlign w:val="center"/>
           </w:tcPr>
           <w:p>
@@ -7904,8 +7904,8 @@
         </w:tc>
         <w:tc>
           <w:tcPr>
-            <w:tcW w:type="dxa" w:w="1563"/>
-            <w:shd w:fill="F2F2F2"/>
+            <w:tcW w:type="dxa" w:w="533"/>
+            <w:shd w:fill="F5F5F5"/>
             <w:vAlign w:val="center"/>
           </w:tcPr>
           <w:p>
@@ -7927,8 +7927,8 @@
         </w:tc>
         <w:tc>
           <w:tcPr>
-            <w:tcW w:type="dxa" w:w="1563"/>
-            <w:shd w:fill="F2F2F2"/>
+            <w:tcW w:type="dxa" w:w="533"/>
+            <w:shd w:fill="F5F5F5"/>
             <w:vAlign w:val="center"/>
           </w:tcPr>
           <w:p>
@@ -7955,7 +7955,7 @@
         </w:trPr>
         <w:tc>
           <w:tcPr>
-            <w:tcW w:type="dxa" w:w="1563"/>
+            <w:tcW w:type="dxa" w:w="518"/>
             <w:vAlign w:val="center"/>
           </w:tcPr>
           <w:p>
@@ -7977,7 +7977,7 @@
         </w:tc>
         <w:tc>
           <w:tcPr>
-            <w:tcW w:type="dxa" w:w="1563"/>
+            <w:tcW w:type="dxa" w:w="7762"/>
             <w:vAlign w:val="center"/>
           </w:tcPr>
           <w:p>
@@ -7999,7 +7999,7 @@
         </w:tc>
         <w:tc>
           <w:tcPr>
-            <w:tcW w:type="dxa" w:w="1563"/>
+            <w:tcW w:type="dxa" w:w="533"/>
             <w:vAlign w:val="center"/>
           </w:tcPr>
           <w:p>
@@ -8021,7 +8021,7 @@
         </w:tc>
         <w:tc>
           <w:tcPr>
-            <w:tcW w:type="dxa" w:w="1563"/>
+            <w:tcW w:type="dxa" w:w="533"/>
             <w:vAlign w:val="center"/>
           </w:tcPr>
           <w:p>
@@ -8043,7 +8043,7 @@
         </w:tc>
         <w:tc>
           <w:tcPr>
-            <w:tcW w:type="dxa" w:w="1563"/>
+            <w:tcW w:type="dxa" w:w="533"/>
             <w:vAlign w:val="center"/>
           </w:tcPr>
           <w:p>
@@ -8065,7 +8065,7 @@
         </w:tc>
         <w:tc>
           <w:tcPr>
-            <w:tcW w:type="dxa" w:w="1563"/>
+            <w:tcW w:type="dxa" w:w="533"/>
             <w:vAlign w:val="center"/>
           </w:tcPr>
           <w:p>
@@ -8087,7 +8087,7 @@
         </w:tc>
         <w:tc>
           <w:tcPr>
-            <w:tcW w:type="dxa" w:w="1563"/>
+            <w:tcW w:type="dxa" w:w="533"/>
             <w:vAlign w:val="center"/>
           </w:tcPr>
           <w:p>
@@ -8114,8 +8114,8 @@
         </w:trPr>
         <w:tc>
           <w:tcPr>
-            <w:tcW w:type="dxa" w:w="1563"/>
-            <w:shd w:fill="F2F2F2"/>
+            <w:tcW w:type="dxa" w:w="518"/>
+            <w:shd w:fill="F5F5F5"/>
             <w:vAlign w:val="center"/>
           </w:tcPr>
           <w:p>
@@ -8137,8 +8137,8 @@
         </w:tc>
         <w:tc>
           <w:tcPr>
-            <w:tcW w:type="dxa" w:w="1563"/>
-            <w:shd w:fill="F2F2F2"/>
+            <w:tcW w:type="dxa" w:w="7762"/>
+            <w:shd w:fill="F5F5F5"/>
             <w:vAlign w:val="center"/>
           </w:tcPr>
           <w:p>
@@ -8160,8 +8160,8 @@
         </w:tc>
         <w:tc>
           <w:tcPr>
-            <w:tcW w:type="dxa" w:w="1563"/>
-            <w:shd w:fill="F2F2F2"/>
+            <w:tcW w:type="dxa" w:w="533"/>
+            <w:shd w:fill="F5F5F5"/>
             <w:vAlign w:val="center"/>
           </w:tcPr>
           <w:p>
@@ -8183,8 +8183,8 @@
         </w:tc>
         <w:tc>
           <w:tcPr>
-            <w:tcW w:type="dxa" w:w="1563"/>
-            <w:shd w:fill="F2F2F2"/>
+            <w:tcW w:type="dxa" w:w="533"/>
+            <w:shd w:fill="F5F5F5"/>
             <w:vAlign w:val="center"/>
           </w:tcPr>
           <w:p>
@@ -8206,8 +8206,8 @@
         </w:tc>
         <w:tc>
           <w:tcPr>
-            <w:tcW w:type="dxa" w:w="1563"/>
-            <w:shd w:fill="F2F2F2"/>
+            <w:tcW w:type="dxa" w:w="533"/>
+            <w:shd w:fill="F5F5F5"/>
             <w:vAlign w:val="center"/>
           </w:tcPr>
           <w:p>
@@ -8229,8 +8229,8 @@
         </w:tc>
         <w:tc>
           <w:tcPr>
-            <w:tcW w:type="dxa" w:w="1563"/>
-            <w:shd w:fill="F2F2F2"/>
+            <w:tcW w:type="dxa" w:w="533"/>
+            <w:shd w:fill="F5F5F5"/>
             <w:vAlign w:val="center"/>
           </w:tcPr>
           <w:p>
@@ -8252,8 +8252,8 @@
         </w:tc>
         <w:tc>
           <w:tcPr>
-            <w:tcW w:type="dxa" w:w="1563"/>
-            <w:shd w:fill="F2F2F2"/>
+            <w:tcW w:type="dxa" w:w="533"/>
+            <w:shd w:fill="F5F5F5"/>
             <w:vAlign w:val="center"/>
           </w:tcPr>
           <w:p>

</xml_diff>